<commit_message>
feat(research): add PRD and SRS docx, enforce 12pt Times New Roman, XML table borders, and zero em dashes
</commit_message>
<xml_diff>
--- a/research/technical_report.docx
+++ b/research/technical_report.docx
@@ -4,7 +4,7 @@
   <w:body>
     <w:p>
       <w:pPr>
-        <w:spacing w:before="280" w:after="80"/>
+        <w:spacing w:before="240" w:after="80"/>
         <w:jc w:val="center"/>
       </w:pPr>
       <w:r>
@@ -12,41 +12,55 @@
           <w:rFonts w:ascii="Arial" w:hAnsi="Arial"/>
           <w:b/>
           <w:color w:val="0B1D3A"/>
-          <w:sz w:val="40"/>
+          <w:sz w:val="36"/>
         </w:rPr>
         <w:t>TECHNICAL REPORT &amp; DEPLOYMENT SPECIFICATION</w:t>
       </w:r>
     </w:p>
     <w:p>
       <w:pPr>
-        <w:spacing w:after="360"/>
+        <w:spacing w:after="280"/>
         <w:jc w:val="center"/>
       </w:pPr>
       <w:r>
         <w:rPr>
           <w:rFonts w:ascii="Arial" w:hAnsi="Arial"/>
           <w:i/>
-          <w:color w:val="475569"/>
-          <w:sz w:val="23"/>
+          <w:color w:val="64748B"/>
+          <w:sz w:val="22"/>
         </w:rPr>
-        <w:t>Securing the Digital Mine: Edge-Ready Metaheuristic Optimized Deep Learning Intrusion Detection</w:t>
+        <w:t>Securing the Digital Mine: Edge-Ready Metaheuristic-Optimized Deep Learning Intrusion Detection</w:t>
+        <w:br/>
+        <w:t>UNESCO Russian-African Forum of Young Scientists 2026</w:t>
       </w:r>
     </w:p>
     <w:p>
       <w:pPr>
-        <w:spacing w:after="400"/>
+        <w:spacing w:after="40"/>
         <w:jc w:val="center"/>
       </w:pPr>
       <w:r>
         <w:rPr>
           <w:rFonts w:ascii="Times New Roman" w:hAnsi="Times New Roman"/>
           <w:b/>
-          <w:color w:val="00529B"/>
-          <w:sz w:val="20"/>
+          <w:sz w:val="22"/>
         </w:rPr>
         <w:t>Engineering Delegation: John Okyere, Ezekeil Baah, Clement Baffour, Parker Paa Annobil, George Akwesi Bonnah</w:t>
-        <w:br/>
-        <w:t>University of Education, Winneba &amp; Kayaba Labs | UNESCO Russian-African Forum 2026</w:t>
+      </w:r>
+    </w:p>
+    <w:p>
+      <w:pPr>
+        <w:spacing w:after="320"/>
+        <w:jc w:val="center"/>
+      </w:pPr>
+      <w:r>
+        <w:rPr>
+          <w:rFonts w:ascii="Times New Roman" w:hAnsi="Times New Roman"/>
+          <w:i/>
+          <w:color w:val="64748B"/>
+          <w:sz w:val="19"/>
+        </w:rPr>
+        <w:t>Department of ICT, University of Education, Winneba &amp; Kayaba Labs | Version 3.0.0</w:t>
       </w:r>
     </w:p>
     <w:p>
@@ -59,46 +73,46 @@
           <w:rFonts w:ascii="Arial" w:hAnsi="Arial"/>
           <w:b/>
           <w:color w:val="00529B"/>
-          <w:sz w:val="27"/>
+          <w:sz w:val="28"/>
         </w:rPr>
         <w:t>1. EXECUTIVE SUMMARY</w:t>
       </w:r>
     </w:p>
     <w:p>
       <w:pPr>
-        <w:spacing w:line="312" w:lineRule="auto" w:after="120"/>
+        <w:spacing w:line="360" w:lineRule="auto" w:after="120"/>
         <w:jc w:val="both"/>
       </w:pPr>
       <w:r>
         <w:rPr>
           <w:rFonts w:ascii="Times New Roman" w:hAnsi="Times New Roman"/>
-          <w:sz w:val="21"/>
+          <w:sz w:val="24"/>
         </w:rPr>
-        <w:t>Modern mineral resource operations across Africa and the Russian Federation are undergoing rapid digital transformation under 'Smart Subsoil' initiatives. Heavy mining equipment—including ball mills, cone crushers, autonomous haul trucks, and tailings pumps—are increasingly connected to operational technology (OT) SCADA networks. While this connectivity drives massive productivity and safety gains, it creates severe vulnerabilities to malicious cyber disruption. Unplanned industrial downtime in mining facilities costs between USD $50,000 and $500,000 per hour, while cyber-physical attacks on ventilation or tailings management represent direct threats to human life.</w:t>
+        <w:t>Modern mineral resource operations across Africa and the Russian Federation are undergoing rapid digital transformation under 'Smart Subsoil' initiatives. Heavy mining equipment (including semi-autogenous grinding (SAG) mills, cone crushers, autonomous haul trucks, and tailings pumps) are increasingly networked into operational technology (OT) SCADA networks. While this connectivity drives massive productivity and safety gains, it creates severe vulnerabilities to malicious cyber disruption. Unplanned industrial downtime in mining facilities costs between USD $50,000 and $500,000 per hour, while cyber-physical attacks on ventilation or tailings management represent direct threats to human life.</w:t>
       </w:r>
     </w:p>
     <w:p>
       <w:pPr>
-        <w:spacing w:line="312" w:lineRule="auto" w:after="120"/>
+        <w:spacing w:line="360" w:lineRule="auto" w:after="120"/>
         <w:jc w:val="both"/>
       </w:pPr>
       <w:r>
         <w:rPr>
           <w:rFonts w:ascii="Times New Roman" w:hAnsi="Times New Roman"/>
-          <w:sz w:val="21"/>
+          <w:sz w:val="24"/>
         </w:rPr>
         <w:t>Commercial enterprise cybersecurity solutions cannot solve this problem because they rely on static signatures, cloud-based inspection requiring high-bandwidth links, and heavy computation that exceeds the 100-millisecond control loop deadlines of industrial PLCs. Remote African mining operations operating on solar power and satellite links require lightweight, offline-capable, real-time edge security.</w:t>
       </w:r>
     </w:p>
     <w:p>
       <w:pPr>
-        <w:spacing w:line="312" w:lineRule="auto" w:after="120"/>
+        <w:spacing w:line="360" w:lineRule="auto" w:after="120"/>
         <w:jc w:val="both"/>
       </w:pPr>
       <w:r>
         <w:rPr>
           <w:rFonts w:ascii="Times New Roman" w:hAnsi="Times New Roman"/>
-          <w:sz w:val="21"/>
+          <w:sz w:val="24"/>
         </w:rPr>
         <w:t>This technical report details the architecture, implementation, and deployment of a three-tier intrusion detection framework combining Binary Whale Optimization (BWOA) with a spatial-temporal CNN-LSTM neural network. By pruning network telemetry from 41 features to 10 (75.61% reduction) and applying Float16 quantization, the system achieves an inference latency of 0.76 milliseconds on a standard Raspberry Pi 4 edge device while maintaining 70.56% multi-class accuracy and 96.89% precision on benign flows. The complete open-source solution enables mining operators to achieve immediate cyber resilience at negligible capital cost.</w:t>
       </w:r>
@@ -113,14 +127,14 @@
           <w:rFonts w:ascii="Arial" w:hAnsi="Arial"/>
           <w:b/>
           <w:color w:val="00529B"/>
-          <w:sz w:val="27"/>
+          <w:sz w:val="28"/>
         </w:rPr>
         <w:t>2. TECHNICAL ARCHITECTURE &amp; DEEP DIVE</w:t>
       </w:r>
     </w:p>
     <w:p>
       <w:pPr>
-        <w:spacing w:before="120" w:after="40"/>
+        <w:spacing w:before="160" w:after="40"/>
         <w:jc w:val="center"/>
       </w:pPr>
       <w:r>
@@ -160,15 +174,15 @@
     </w:p>
     <w:p>
       <w:pPr>
-        <w:spacing w:after="160"/>
+        <w:spacing w:after="200"/>
         <w:jc w:val="center"/>
       </w:pPr>
       <w:r>
         <w:rPr>
           <w:rFonts w:ascii="Times New Roman" w:hAnsi="Times New Roman"/>
           <w:i/>
-          <w:color w:val="475569"/>
-          <w:sz w:val="18"/>
+          <w:color w:val="64748B"/>
+          <w:sz w:val="20"/>
         </w:rPr>
         <w:t>Figure 2.1: Four-Layer End-to-End System Architecture</w:t>
       </w:r>
@@ -182,21 +196,21 @@
         <w:rPr>
           <w:rFonts w:ascii="Arial" w:hAnsi="Arial"/>
           <w:b/>
-          <w:color w:val="0F172A"/>
-          <w:sz w:val="23"/>
+          <w:color w:val="1E293B"/>
+          <w:sz w:val="25"/>
         </w:rPr>
         <w:t>2.1 Layer 1: Edge Telemetry Ingestion Agent</w:t>
       </w:r>
     </w:p>
     <w:p>
       <w:pPr>
-        <w:spacing w:line="312" w:lineRule="auto" w:after="120"/>
+        <w:spacing w:line="360" w:lineRule="auto" w:after="120"/>
         <w:jc w:val="both"/>
       </w:pPr>
       <w:r>
         <w:rPr>
           <w:rFonts w:ascii="Times New Roman" w:hAnsi="Times New Roman"/>
-          <w:sz w:val="21"/>
+          <w:sz w:val="24"/>
         </w:rPr>
         <w:t>The edge telemetry ingestion agent (@mhiskall282/unesco-mine-sec-cli) is packaged as a high-performance Node.js service designed to run directly on edge gateways, micro-PLCs, or local aggregation servers. It captures raw network frames from promiscuous network adapters (Ethernet, Wi-Fi, TAP bridges), parses IP/TCP/UDP headers, and streams structured JSON payloads containing the 10 BWOA-selected features over HTTP/HTTPS.</w:t>
       </w:r>
@@ -210,28 +224,28 @@
         <w:rPr>
           <w:rFonts w:ascii="Arial" w:hAnsi="Arial"/>
           <w:b/>
-          <w:color w:val="0F172A"/>
-          <w:sz w:val="23"/>
+          <w:color w:val="1E293B"/>
+          <w:sz w:val="25"/>
         </w:rPr>
         <w:t>2.2 Layer 2: BWOA Feature Selection Engine</w:t>
       </w:r>
     </w:p>
     <w:p>
       <w:pPr>
-        <w:spacing w:line="312" w:lineRule="auto" w:after="120"/>
+        <w:spacing w:line="360" w:lineRule="auto" w:after="120"/>
         <w:jc w:val="both"/>
       </w:pPr>
       <w:r>
         <w:rPr>
           <w:rFonts w:ascii="Times New Roman" w:hAnsi="Times New Roman"/>
-          <w:sz w:val="21"/>
+          <w:sz w:val="24"/>
         </w:rPr>
         <w:t>The Binary Whale Optimization Algorithm (BWOA) conducts metaheuristic exploration of the 2^41 discrete feature space. Continuous velocity vectors are mapped to bit-flip probabilities using a V-shaped transfer function with a strict 75% accuracy floor constraint to ensure high discrimination on minority attack classes.</w:t>
       </w:r>
     </w:p>
     <w:p>
       <w:pPr>
-        <w:spacing w:before="120" w:after="40"/>
+        <w:spacing w:before="160" w:after="40"/>
         <w:jc w:val="center"/>
       </w:pPr>
       <w:r>
@@ -271,15 +285,15 @@
     </w:p>
     <w:p>
       <w:pPr>
-        <w:spacing w:after="160"/>
+        <w:spacing w:after="200"/>
         <w:jc w:val="center"/>
       </w:pPr>
       <w:r>
         <w:rPr>
           <w:rFonts w:ascii="Times New Roman" w:hAnsi="Times New Roman"/>
           <w:i/>
-          <w:color w:val="475569"/>
-          <w:sz w:val="18"/>
+          <w:color w:val="64748B"/>
+          <w:sz w:val="20"/>
         </w:rPr>
         <w:t>Figure 2.2: BWOA Optimization Convergence across 100 Iterations</w:t>
       </w:r>
@@ -293,28 +307,28 @@
         <w:rPr>
           <w:rFonts w:ascii="Arial" w:hAnsi="Arial"/>
           <w:b/>
-          <w:color w:val="0F172A"/>
-          <w:sz w:val="23"/>
+          <w:color w:val="1E293B"/>
+          <w:sz w:val="25"/>
         </w:rPr>
         <w:t>2.3 Layer 3: Spatial-Temporal CNN-LSTM Classifier</w:t>
       </w:r>
     </w:p>
     <w:p>
       <w:pPr>
-        <w:spacing w:line="312" w:lineRule="auto" w:after="120"/>
+        <w:spacing w:line="360" w:lineRule="auto" w:after="120"/>
         <w:jc w:val="both"/>
       </w:pPr>
       <w:r>
         <w:rPr>
           <w:rFonts w:ascii="Times New Roman" w:hAnsi="Times New Roman"/>
-          <w:sz w:val="21"/>
+          <w:sz w:val="24"/>
         </w:rPr>
         <w:t>The deep learning engine combines a 1D Convolutional Neural Network (Conv1D) layer (64 filters, kernel size 3) with a Long Short-Term Memory (LSTM) layer (256 units). The Conv1D filters isolate local spatial relationships between byte values, while the LSTM recurrent units track temporal state transitions across sequential polling cycles.</w:t>
       </w:r>
     </w:p>
     <w:p>
       <w:pPr>
-        <w:spacing w:before="120" w:after="40"/>
+        <w:spacing w:before="160" w:after="40"/>
         <w:jc w:val="center"/>
       </w:pPr>
       <w:r>
@@ -354,15 +368,15 @@
     </w:p>
     <w:p>
       <w:pPr>
-        <w:spacing w:after="160"/>
+        <w:spacing w:after="200"/>
         <w:jc w:val="center"/>
       </w:pPr>
       <w:r>
         <w:rPr>
           <w:rFonts w:ascii="Times New Roman" w:hAnsi="Times New Roman"/>
           <w:i/>
-          <w:color w:val="475569"/>
-          <w:sz w:val="18"/>
+          <w:color w:val="64748B"/>
+          <w:sz w:val="20"/>
         </w:rPr>
         <w:t>Figure 2.3: CNN-LSTM Neural Network Architecture Flowchart</w:t>
       </w:r>
@@ -376,21 +390,21 @@
         <w:rPr>
           <w:rFonts w:ascii="Arial" w:hAnsi="Arial"/>
           <w:b/>
-          <w:color w:val="0F172A"/>
-          <w:sz w:val="23"/>
+          <w:color w:val="1E293B"/>
+          <w:sz w:val="25"/>
         </w:rPr>
         <w:t>2.4 Layer 4: Model Server &amp; SaaS Livewire Dashboard</w:t>
       </w:r>
     </w:p>
     <w:p>
       <w:pPr>
-        <w:spacing w:line="312" w:lineRule="auto" w:after="120"/>
+        <w:spacing w:line="360" w:lineRule="auto" w:after="120"/>
         <w:jc w:val="both"/>
       </w:pPr>
       <w:r>
         <w:rPr>
           <w:rFonts w:ascii="Times New Roman" w:hAnsi="Times New Roman"/>
-          <w:sz w:val="21"/>
+          <w:sz w:val="24"/>
         </w:rPr>
         <w:t>The inference microservice runs an asynchronous FastAPI server (port 8001) executing the quantized Float16 TFLite model. Threat predictions are ingested by a multi-tenant Laravel 12 Livewire SaaS dashboard that broadcasts live alerts, maps device telemetry, and registers incident logs.</w:t>
       </w:r>
@@ -405,7 +419,7 @@
           <w:rFonts w:ascii="Arial" w:hAnsi="Arial"/>
           <w:b/>
           <w:color w:val="00529B"/>
-          <w:sz w:val="27"/>
+          <w:sz w:val="28"/>
         </w:rPr>
         <w:t>3. DEPLOYMENT &amp; INSTALLATION GUIDE</w:t>
       </w:r>
@@ -419,21 +433,21 @@
         <w:rPr>
           <w:rFonts w:ascii="Arial" w:hAnsi="Arial"/>
           <w:b/>
-          <w:color w:val="0F172A"/>
-          <w:sz w:val="23"/>
+          <w:color w:val="1E293B"/>
+          <w:sz w:val="25"/>
         </w:rPr>
         <w:t>3.1 Edge Gateway Deployment (Raspberry Pi 4B / Pi 5)</w:t>
       </w:r>
     </w:p>
     <w:p>
       <w:pPr>
-        <w:spacing w:line="312" w:lineRule="auto" w:after="120"/>
+        <w:spacing w:line="360" w:lineRule="auto" w:after="120"/>
         <w:jc w:val="both"/>
       </w:pPr>
       <w:r>
         <w:rPr>
           <w:rFonts w:ascii="Times New Roman" w:hAnsi="Times New Roman"/>
-          <w:sz w:val="21"/>
+          <w:sz w:val="24"/>
         </w:rPr>
         <w:t>Follow these steps to deploy the complete intrusion detection stack on a Linux edge gateway:</w:t>
       </w:r>
@@ -443,6 +457,14 @@
         <w:tblW w:type="auto" w:w="0"/>
         <w:jc w:val="center"/>
         <w:tblLook w:firstColumn="1" w:firstRow="1" w:lastColumn="0" w:lastRow="0" w:noHBand="0" w:noVBand="1" w:val="04A0"/>
+        <w:tblBorders>
+          <w:top w:val="single" w:sz="6" w:space="0" w:color="334155"/>
+          <w:bottom w:val="single" w:sz="6" w:space="0" w:color="334155"/>
+          <w:left w:val="single" w:sz="6" w:space="0" w:color="334155"/>
+          <w:right w:val="single" w:sz="6" w:space="0" w:color="334155"/>
+          <w:insideH w:val="single" w:sz="6" w:space="0" w:color="334155"/>
+          <w:insideV w:val="single" w:sz="6" w:space="0" w:color="334155"/>
+        </w:tblBorders>
       </w:tblPr>
       <w:tblGrid>
         <w:gridCol w:w="9360"/>
@@ -461,13 +483,13 @@
           </w:tcPr>
           <w:p>
             <w:pPr>
-              <w:spacing w:after="40"/>
+              <w:spacing w:after="40" w:line="276" w:lineRule="auto"/>
             </w:pPr>
             <w:r>
               <w:rPr>
                 <w:rFonts w:ascii="Consolas" w:hAnsi="Consolas"/>
                 <w:color w:val="E2E8F0"/>
-                <w:sz w:val="17"/>
+                <w:sz w:val="18"/>
               </w:rPr>
               <w:t># 1. Clone the project repository</w:t>
               <w:br/>
@@ -509,8 +531,8 @@
         <w:rPr>
           <w:rFonts w:ascii="Arial" w:hAnsi="Arial"/>
           <w:b/>
-          <w:color w:val="0F172A"/>
-          <w:sz w:val="23"/>
+          <w:color w:val="1E293B"/>
+          <w:sz w:val="25"/>
         </w:rPr>
         <w:t>3.2 Cloud Inference Server Deployment (AWS EC2 / Ubuntu 22.04)</w:t>
       </w:r>
@@ -520,6 +542,14 @@
         <w:tblW w:type="auto" w:w="0"/>
         <w:jc w:val="center"/>
         <w:tblLook w:firstColumn="1" w:firstRow="1" w:lastColumn="0" w:lastRow="0" w:noHBand="0" w:noVBand="1" w:val="04A0"/>
+        <w:tblBorders>
+          <w:top w:val="single" w:sz="6" w:space="0" w:color="334155"/>
+          <w:bottom w:val="single" w:sz="6" w:space="0" w:color="334155"/>
+          <w:left w:val="single" w:sz="6" w:space="0" w:color="334155"/>
+          <w:right w:val="single" w:sz="6" w:space="0" w:color="334155"/>
+          <w:insideH w:val="single" w:sz="6" w:space="0" w:color="334155"/>
+          <w:insideV w:val="single" w:sz="6" w:space="0" w:color="334155"/>
+        </w:tblBorders>
       </w:tblPr>
       <w:tblGrid>
         <w:gridCol w:w="9360"/>
@@ -538,13 +568,13 @@
           </w:tcPr>
           <w:p>
             <w:pPr>
-              <w:spacing w:after="40"/>
+              <w:spacing w:after="40" w:line="276" w:lineRule="auto"/>
             </w:pPr>
             <w:r>
               <w:rPr>
                 <w:rFonts w:ascii="Consolas" w:hAnsi="Consolas"/>
                 <w:color w:val="E2E8F0"/>
-                <w:sz w:val="17"/>
+                <w:sz w:val="18"/>
               </w:rPr>
               <w:t># 1. Provision Ubuntu 22.04 LTS instance (t3.medium recommended)</w:t>
               <w:br/>
@@ -584,7 +614,7 @@
           <w:rFonts w:ascii="Arial" w:hAnsi="Arial"/>
           <w:b/>
           <w:color w:val="00529B"/>
-          <w:sz w:val="27"/>
+          <w:sz w:val="28"/>
         </w:rPr>
         <w:t>4. COMPREHENSIVE EVALUATION RESULTS</w:t>
       </w:r>
@@ -595,6 +625,14 @@
         <w:jc w:val="center"/>
         <w:tblLayout w:type="fixed"/>
         <w:tblLook w:firstColumn="1" w:firstRow="1" w:lastColumn="0" w:lastRow="0" w:noHBand="0" w:noVBand="1" w:val="04A0"/>
+        <w:tblBorders>
+          <w:top w:val="single" w:sz="4" w:space="0" w:color="CBD5E1"/>
+          <w:bottom w:val="single" w:sz="4" w:space="0" w:color="CBD5E1"/>
+          <w:left w:val="single" w:sz="4" w:space="0" w:color="CBD5E1"/>
+          <w:right w:val="single" w:sz="4" w:space="0" w:color="CBD5E1"/>
+          <w:insideH w:val="single" w:sz="4" w:space="0" w:color="CBD5E1"/>
+          <w:insideV w:val="single" w:sz="4" w:space="0" w:color="CBD5E1"/>
+        </w:tblBorders>
       </w:tblPr>
       <w:tblGrid>
         <w:gridCol w:w="1872"/>
@@ -609,10 +647,10 @@
             <w:tcW w:type="dxa" w:w="2592"/>
             <w:shd w:fill="00529B"/>
             <w:tcMar>
-              <w:top w:w="100" w:type="dxa"/>
-              <w:bottom w:w="100" w:type="dxa"/>
-              <w:left w:w="120" w:type="dxa"/>
-              <w:right w:w="120" w:type="dxa"/>
+              <w:top w:w="120" w:type="dxa"/>
+              <w:bottom w:w="120" w:type="dxa"/>
+              <w:left w:w="140" w:type="dxa"/>
+              <w:right w:w="140" w:type="dxa"/>
             </w:tcMar>
           </w:tcPr>
           <w:p>
@@ -624,7 +662,7 @@
                 <w:rFonts w:ascii="Arial" w:hAnsi="Arial"/>
                 <w:b/>
                 <w:color w:val="FFFFFF"/>
-                <w:sz w:val="18"/>
+                <w:sz w:val="20"/>
               </w:rPr>
               <w:t>Metric Category</w:t>
             </w:r>
@@ -635,10 +673,10 @@
             <w:tcW w:type="dxa" w:w="1872"/>
             <w:shd w:fill="00529B"/>
             <w:tcMar>
-              <w:top w:w="100" w:type="dxa"/>
-              <w:bottom w:w="100" w:type="dxa"/>
-              <w:left w:w="120" w:type="dxa"/>
-              <w:right w:w="120" w:type="dxa"/>
+              <w:top w:w="120" w:type="dxa"/>
+              <w:bottom w:w="120" w:type="dxa"/>
+              <w:left w:w="140" w:type="dxa"/>
+              <w:right w:w="140" w:type="dxa"/>
             </w:tcMar>
           </w:tcPr>
           <w:p>
@@ -650,7 +688,7 @@
                 <w:rFonts w:ascii="Arial" w:hAnsi="Arial"/>
                 <w:b/>
                 <w:color w:val="FFFFFF"/>
-                <w:sz w:val="18"/>
+                <w:sz w:val="20"/>
               </w:rPr>
               <w:t>Baseline (41 Feat)</w:t>
             </w:r>
@@ -661,10 +699,10 @@
             <w:tcW w:type="dxa" w:w="1872"/>
             <w:shd w:fill="00529B"/>
             <w:tcMar>
-              <w:top w:w="100" w:type="dxa"/>
-              <w:bottom w:w="100" w:type="dxa"/>
-              <w:left w:w="120" w:type="dxa"/>
-              <w:right w:w="120" w:type="dxa"/>
+              <w:top w:w="120" w:type="dxa"/>
+              <w:bottom w:w="120" w:type="dxa"/>
+              <w:left w:w="140" w:type="dxa"/>
+              <w:right w:w="140" w:type="dxa"/>
             </w:tcMar>
           </w:tcPr>
           <w:p>
@@ -676,7 +714,7 @@
                 <w:rFonts w:ascii="Arial" w:hAnsi="Arial"/>
                 <w:b/>
                 <w:color w:val="FFFFFF"/>
-                <w:sz w:val="18"/>
+                <w:sz w:val="20"/>
               </w:rPr>
               <w:t>BWOA v3 (10 Feat)</w:t>
             </w:r>
@@ -687,10 +725,10 @@
             <w:tcW w:type="dxa" w:w="1872"/>
             <w:shd w:fill="00529B"/>
             <w:tcMar>
-              <w:top w:w="100" w:type="dxa"/>
-              <w:bottom w:w="100" w:type="dxa"/>
-              <w:left w:w="120" w:type="dxa"/>
-              <w:right w:w="120" w:type="dxa"/>
+              <w:top w:w="120" w:type="dxa"/>
+              <w:bottom w:w="120" w:type="dxa"/>
+              <w:left w:w="140" w:type="dxa"/>
+              <w:right w:w="140" w:type="dxa"/>
             </w:tcMar>
           </w:tcPr>
           <w:p>
@@ -702,7 +740,7 @@
                 <w:rFonts w:ascii="Arial" w:hAnsi="Arial"/>
                 <w:b/>
                 <w:color w:val="FFFFFF"/>
-                <w:sz w:val="18"/>
+                <w:sz w:val="20"/>
               </w:rPr>
               <w:t>BWOA Float16</w:t>
             </w:r>
@@ -713,10 +751,10 @@
             <w:tcW w:type="dxa" w:w="1872"/>
             <w:shd w:fill="00529B"/>
             <w:tcMar>
-              <w:top w:w="100" w:type="dxa"/>
-              <w:bottom w:w="100" w:type="dxa"/>
-              <w:left w:w="120" w:type="dxa"/>
-              <w:right w:w="120" w:type="dxa"/>
+              <w:top w:w="120" w:type="dxa"/>
+              <w:bottom w:w="120" w:type="dxa"/>
+              <w:left w:w="140" w:type="dxa"/>
+              <w:right w:w="140" w:type="dxa"/>
             </w:tcMar>
           </w:tcPr>
           <w:p>
@@ -728,7 +766,7 @@
                 <w:rFonts w:ascii="Arial" w:hAnsi="Arial"/>
                 <w:b/>
                 <w:color w:val="FFFFFF"/>
-                <w:sz w:val="18"/>
+                <w:sz w:val="20"/>
               </w:rPr>
               <w:t>SWaT Transfer</w:t>
             </w:r>
@@ -741,10 +779,10 @@
             <w:tcW w:type="dxa" w:w="2592"/>
             <w:shd w:fill="FFFFFF"/>
             <w:tcMar>
-              <w:top w:w="60" w:type="dxa"/>
-              <w:bottom w:w="60" w:type="dxa"/>
-              <w:left w:w="100" w:type="dxa"/>
-              <w:right w:w="100" w:type="dxa"/>
+              <w:top w:w="80" w:type="dxa"/>
+              <w:bottom w:w="80" w:type="dxa"/>
+              <w:left w:w="120" w:type="dxa"/>
+              <w:right w:w="120" w:type="dxa"/>
             </w:tcMar>
           </w:tcPr>
           <w:p>
@@ -754,7 +792,7 @@
             <w:r>
               <w:rPr>
                 <w:rFonts w:ascii="Times New Roman" w:hAnsi="Times New Roman"/>
-                <w:sz w:val="18"/>
+                <w:sz w:val="20"/>
               </w:rPr>
               <w:t>Input Dimensions</w:t>
             </w:r>
@@ -765,10 +803,10 @@
             <w:tcW w:type="dxa" w:w="1872"/>
             <w:shd w:fill="FFFFFF"/>
             <w:tcMar>
-              <w:top w:w="60" w:type="dxa"/>
-              <w:bottom w:w="60" w:type="dxa"/>
-              <w:left w:w="100" w:type="dxa"/>
-              <w:right w:w="100" w:type="dxa"/>
+              <w:top w:w="80" w:type="dxa"/>
+              <w:bottom w:w="80" w:type="dxa"/>
+              <w:left w:w="120" w:type="dxa"/>
+              <w:right w:w="120" w:type="dxa"/>
             </w:tcMar>
           </w:tcPr>
           <w:p>
@@ -778,7 +816,7 @@
             <w:r>
               <w:rPr>
                 <w:rFonts w:ascii="Times New Roman" w:hAnsi="Times New Roman"/>
-                <w:sz w:val="18"/>
+                <w:sz w:val="20"/>
               </w:rPr>
               <w:t>41 Features</w:t>
             </w:r>
@@ -789,10 +827,10 @@
             <w:tcW w:type="dxa" w:w="1872"/>
             <w:shd w:fill="FFFFFF"/>
             <w:tcMar>
-              <w:top w:w="60" w:type="dxa"/>
-              <w:bottom w:w="60" w:type="dxa"/>
-              <w:left w:w="100" w:type="dxa"/>
-              <w:right w:w="100" w:type="dxa"/>
+              <w:top w:w="80" w:type="dxa"/>
+              <w:bottom w:w="80" w:type="dxa"/>
+              <w:left w:w="120" w:type="dxa"/>
+              <w:right w:w="120" w:type="dxa"/>
             </w:tcMar>
           </w:tcPr>
           <w:p>
@@ -802,7 +840,7 @@
             <w:r>
               <w:rPr>
                 <w:rFonts w:ascii="Times New Roman" w:hAnsi="Times New Roman"/>
-                <w:sz w:val="18"/>
+                <w:sz w:val="20"/>
               </w:rPr>
               <w:t>10 Features</w:t>
             </w:r>
@@ -813,10 +851,10 @@
             <w:tcW w:type="dxa" w:w="1872"/>
             <w:shd w:fill="FFFFFF"/>
             <w:tcMar>
-              <w:top w:w="60" w:type="dxa"/>
-              <w:bottom w:w="60" w:type="dxa"/>
-              <w:left w:w="100" w:type="dxa"/>
-              <w:right w:w="100" w:type="dxa"/>
+              <w:top w:w="80" w:type="dxa"/>
+              <w:bottom w:w="80" w:type="dxa"/>
+              <w:left w:w="120" w:type="dxa"/>
+              <w:right w:w="120" w:type="dxa"/>
             </w:tcMar>
           </w:tcPr>
           <w:p>
@@ -826,7 +864,7 @@
             <w:r>
               <w:rPr>
                 <w:rFonts w:ascii="Times New Roman" w:hAnsi="Times New Roman"/>
-                <w:sz w:val="18"/>
+                <w:sz w:val="20"/>
               </w:rPr>
               <w:t>10 Features</w:t>
             </w:r>
@@ -837,10 +875,10 @@
             <w:tcW w:type="dxa" w:w="1872"/>
             <w:shd w:fill="FFFFFF"/>
             <w:tcMar>
-              <w:top w:w="60" w:type="dxa"/>
-              <w:bottom w:w="60" w:type="dxa"/>
-              <w:left w:w="100" w:type="dxa"/>
-              <w:right w:w="100" w:type="dxa"/>
+              <w:top w:w="80" w:type="dxa"/>
+              <w:bottom w:w="80" w:type="dxa"/>
+              <w:left w:w="120" w:type="dxa"/>
+              <w:right w:w="120" w:type="dxa"/>
             </w:tcMar>
           </w:tcPr>
           <w:p>
@@ -850,7 +888,7 @@
             <w:r>
               <w:rPr>
                 <w:rFonts w:ascii="Times New Roman" w:hAnsi="Times New Roman"/>
-                <w:sz w:val="18"/>
+                <w:sz w:val="20"/>
               </w:rPr>
               <w:t>51 Sensor Feat</w:t>
             </w:r>
@@ -863,10 +901,10 @@
             <w:tcW w:type="dxa" w:w="2592"/>
             <w:shd w:fill="F8FAFC"/>
             <w:tcMar>
-              <w:top w:w="60" w:type="dxa"/>
-              <w:bottom w:w="60" w:type="dxa"/>
-              <w:left w:w="100" w:type="dxa"/>
-              <w:right w:w="100" w:type="dxa"/>
+              <w:top w:w="80" w:type="dxa"/>
+              <w:bottom w:w="80" w:type="dxa"/>
+              <w:left w:w="120" w:type="dxa"/>
+              <w:right w:w="120" w:type="dxa"/>
             </w:tcMar>
           </w:tcPr>
           <w:p>
@@ -876,7 +914,7 @@
             <w:r>
               <w:rPr>
                 <w:rFonts w:ascii="Times New Roman" w:hAnsi="Times New Roman"/>
-                <w:sz w:val="18"/>
+                <w:sz w:val="20"/>
               </w:rPr>
               <w:t>Test Accuracy</w:t>
             </w:r>
@@ -887,10 +925,10 @@
             <w:tcW w:type="dxa" w:w="1872"/>
             <w:shd w:fill="F8FAFC"/>
             <w:tcMar>
-              <w:top w:w="60" w:type="dxa"/>
-              <w:bottom w:w="60" w:type="dxa"/>
-              <w:left w:w="100" w:type="dxa"/>
-              <w:right w:w="100" w:type="dxa"/>
+              <w:top w:w="80" w:type="dxa"/>
+              <w:bottom w:w="80" w:type="dxa"/>
+              <w:left w:w="120" w:type="dxa"/>
+              <w:right w:w="120" w:type="dxa"/>
             </w:tcMar>
           </w:tcPr>
           <w:p>
@@ -900,7 +938,7 @@
             <w:r>
               <w:rPr>
                 <w:rFonts w:ascii="Times New Roman" w:hAnsi="Times New Roman"/>
-                <w:sz w:val="18"/>
+                <w:sz w:val="20"/>
               </w:rPr>
               <w:t>77.70%</w:t>
             </w:r>
@@ -911,10 +949,10 @@
             <w:tcW w:type="dxa" w:w="1872"/>
             <w:shd w:fill="F8FAFC"/>
             <w:tcMar>
-              <w:top w:w="60" w:type="dxa"/>
-              <w:bottom w:w="60" w:type="dxa"/>
-              <w:left w:w="100" w:type="dxa"/>
-              <w:right w:w="100" w:type="dxa"/>
+              <w:top w:w="80" w:type="dxa"/>
+              <w:bottom w:w="80" w:type="dxa"/>
+              <w:left w:w="120" w:type="dxa"/>
+              <w:right w:w="120" w:type="dxa"/>
             </w:tcMar>
           </w:tcPr>
           <w:p>
@@ -924,7 +962,7 @@
             <w:r>
               <w:rPr>
                 <w:rFonts w:ascii="Times New Roman" w:hAnsi="Times New Roman"/>
-                <w:sz w:val="18"/>
+                <w:sz w:val="20"/>
               </w:rPr>
               <w:t>70.56%</w:t>
             </w:r>
@@ -935,10 +973,10 @@
             <w:tcW w:type="dxa" w:w="1872"/>
             <w:shd w:fill="F8FAFC"/>
             <w:tcMar>
-              <w:top w:w="60" w:type="dxa"/>
-              <w:bottom w:w="60" w:type="dxa"/>
-              <w:left w:w="100" w:type="dxa"/>
-              <w:right w:w="100" w:type="dxa"/>
+              <w:top w:w="80" w:type="dxa"/>
+              <w:bottom w:w="80" w:type="dxa"/>
+              <w:left w:w="120" w:type="dxa"/>
+              <w:right w:w="120" w:type="dxa"/>
             </w:tcMar>
           </w:tcPr>
           <w:p>
@@ -948,7 +986,7 @@
             <w:r>
               <w:rPr>
                 <w:rFonts w:ascii="Times New Roman" w:hAnsi="Times New Roman"/>
-                <w:sz w:val="18"/>
+                <w:sz w:val="20"/>
               </w:rPr>
               <w:t>70.56%</w:t>
             </w:r>
@@ -959,10 +997,10 @@
             <w:tcW w:type="dxa" w:w="1872"/>
             <w:shd w:fill="F8FAFC"/>
             <w:tcMar>
-              <w:top w:w="60" w:type="dxa"/>
-              <w:bottom w:w="60" w:type="dxa"/>
-              <w:left w:w="100" w:type="dxa"/>
-              <w:right w:w="100" w:type="dxa"/>
+              <w:top w:w="80" w:type="dxa"/>
+              <w:bottom w:w="80" w:type="dxa"/>
+              <w:left w:w="120" w:type="dxa"/>
+              <w:right w:w="120" w:type="dxa"/>
             </w:tcMar>
           </w:tcPr>
           <w:p>
@@ -972,7 +1010,7 @@
             <w:r>
               <w:rPr>
                 <w:rFonts w:ascii="Times New Roman" w:hAnsi="Times New Roman"/>
-                <w:sz w:val="18"/>
+                <w:sz w:val="20"/>
               </w:rPr>
               <w:t>59.95%</w:t>
             </w:r>
@@ -985,10 +1023,10 @@
             <w:tcW w:type="dxa" w:w="2592"/>
             <w:shd w:fill="FFFFFF"/>
             <w:tcMar>
-              <w:top w:w="60" w:type="dxa"/>
-              <w:bottom w:w="60" w:type="dxa"/>
-              <w:left w:w="100" w:type="dxa"/>
-              <w:right w:w="100" w:type="dxa"/>
+              <w:top w:w="80" w:type="dxa"/>
+              <w:bottom w:w="80" w:type="dxa"/>
+              <w:left w:w="120" w:type="dxa"/>
+              <w:right w:w="120" w:type="dxa"/>
             </w:tcMar>
           </w:tcPr>
           <w:p>
@@ -998,7 +1036,7 @@
             <w:r>
               <w:rPr>
                 <w:rFonts w:ascii="Times New Roman" w:hAnsi="Times New Roman"/>
-                <w:sz w:val="18"/>
+                <w:sz w:val="20"/>
               </w:rPr>
               <w:t>Macro F1-Score</w:t>
             </w:r>
@@ -1009,10 +1047,10 @@
             <w:tcW w:type="dxa" w:w="1872"/>
             <w:shd w:fill="FFFFFF"/>
             <w:tcMar>
-              <w:top w:w="60" w:type="dxa"/>
-              <w:bottom w:w="60" w:type="dxa"/>
-              <w:left w:w="100" w:type="dxa"/>
-              <w:right w:w="100" w:type="dxa"/>
+              <w:top w:w="80" w:type="dxa"/>
+              <w:bottom w:w="80" w:type="dxa"/>
+              <w:left w:w="120" w:type="dxa"/>
+              <w:right w:w="120" w:type="dxa"/>
             </w:tcMar>
           </w:tcPr>
           <w:p>
@@ -1022,7 +1060,7 @@
             <w:r>
               <w:rPr>
                 <w:rFonts w:ascii="Times New Roman" w:hAnsi="Times New Roman"/>
-                <w:sz w:val="18"/>
+                <w:sz w:val="20"/>
               </w:rPr>
               <w:t>0.7571</w:t>
             </w:r>
@@ -1033,10 +1071,10 @@
             <w:tcW w:type="dxa" w:w="1872"/>
             <w:shd w:fill="FFFFFF"/>
             <w:tcMar>
-              <w:top w:w="60" w:type="dxa"/>
-              <w:bottom w:w="60" w:type="dxa"/>
-              <w:left w:w="100" w:type="dxa"/>
-              <w:right w:w="100" w:type="dxa"/>
+              <w:top w:w="80" w:type="dxa"/>
+              <w:bottom w:w="80" w:type="dxa"/>
+              <w:left w:w="120" w:type="dxa"/>
+              <w:right w:w="120" w:type="dxa"/>
             </w:tcMar>
           </w:tcPr>
           <w:p>
@@ -1046,7 +1084,7 @@
             <w:r>
               <w:rPr>
                 <w:rFonts w:ascii="Times New Roman" w:hAnsi="Times New Roman"/>
-                <w:sz w:val="18"/>
+                <w:sz w:val="20"/>
               </w:rPr>
               <w:t>0.7127</w:t>
             </w:r>
@@ -1057,10 +1095,10 @@
             <w:tcW w:type="dxa" w:w="1872"/>
             <w:shd w:fill="FFFFFF"/>
             <w:tcMar>
-              <w:top w:w="60" w:type="dxa"/>
-              <w:bottom w:w="60" w:type="dxa"/>
-              <w:left w:w="100" w:type="dxa"/>
-              <w:right w:w="100" w:type="dxa"/>
+              <w:top w:w="80" w:type="dxa"/>
+              <w:bottom w:w="80" w:type="dxa"/>
+              <w:left w:w="120" w:type="dxa"/>
+              <w:right w:w="120" w:type="dxa"/>
             </w:tcMar>
           </w:tcPr>
           <w:p>
@@ -1070,7 +1108,7 @@
             <w:r>
               <w:rPr>
                 <w:rFonts w:ascii="Times New Roman" w:hAnsi="Times New Roman"/>
-                <w:sz w:val="18"/>
+                <w:sz w:val="20"/>
               </w:rPr>
               <w:t>0.7127</w:t>
             </w:r>
@@ -1081,10 +1119,10 @@
             <w:tcW w:type="dxa" w:w="1872"/>
             <w:shd w:fill="FFFFFF"/>
             <w:tcMar>
-              <w:top w:w="60" w:type="dxa"/>
-              <w:bottom w:w="60" w:type="dxa"/>
-              <w:left w:w="100" w:type="dxa"/>
-              <w:right w:w="100" w:type="dxa"/>
+              <w:top w:w="80" w:type="dxa"/>
+              <w:bottom w:w="80" w:type="dxa"/>
+              <w:left w:w="120" w:type="dxa"/>
+              <w:right w:w="120" w:type="dxa"/>
             </w:tcMar>
           </w:tcPr>
           <w:p>
@@ -1094,7 +1132,7 @@
             <w:r>
               <w:rPr>
                 <w:rFonts w:ascii="Times New Roman" w:hAnsi="Times New Roman"/>
-                <w:sz w:val="18"/>
+                <w:sz w:val="20"/>
               </w:rPr>
               <w:t>0.5966</w:t>
             </w:r>
@@ -1107,10 +1145,10 @@
             <w:tcW w:type="dxa" w:w="2592"/>
             <w:shd w:fill="F8FAFC"/>
             <w:tcMar>
-              <w:top w:w="60" w:type="dxa"/>
-              <w:bottom w:w="60" w:type="dxa"/>
-              <w:left w:w="100" w:type="dxa"/>
-              <w:right w:w="100" w:type="dxa"/>
+              <w:top w:w="80" w:type="dxa"/>
+              <w:bottom w:w="80" w:type="dxa"/>
+              <w:left w:w="120" w:type="dxa"/>
+              <w:right w:w="120" w:type="dxa"/>
             </w:tcMar>
           </w:tcPr>
           <w:p>
@@ -1120,7 +1158,7 @@
             <w:r>
               <w:rPr>
                 <w:rFonts w:ascii="Times New Roman" w:hAnsi="Times New Roman"/>
-                <w:sz w:val="18"/>
+                <w:sz w:val="20"/>
               </w:rPr>
               <w:t>AUC-ROC Score</w:t>
             </w:r>
@@ -1131,10 +1169,10 @@
             <w:tcW w:type="dxa" w:w="1872"/>
             <w:shd w:fill="F8FAFC"/>
             <w:tcMar>
-              <w:top w:w="60" w:type="dxa"/>
-              <w:bottom w:w="60" w:type="dxa"/>
-              <w:left w:w="100" w:type="dxa"/>
-              <w:right w:w="100" w:type="dxa"/>
+              <w:top w:w="80" w:type="dxa"/>
+              <w:bottom w:w="80" w:type="dxa"/>
+              <w:left w:w="120" w:type="dxa"/>
+              <w:right w:w="120" w:type="dxa"/>
             </w:tcMar>
           </w:tcPr>
           <w:p>
@@ -1144,7 +1182,7 @@
             <w:r>
               <w:rPr>
                 <w:rFonts w:ascii="Times New Roman" w:hAnsi="Times New Roman"/>
-                <w:sz w:val="18"/>
+                <w:sz w:val="20"/>
               </w:rPr>
               <w:t>0.9359</w:t>
             </w:r>
@@ -1155,10 +1193,10 @@
             <w:tcW w:type="dxa" w:w="1872"/>
             <w:shd w:fill="F8FAFC"/>
             <w:tcMar>
-              <w:top w:w="60" w:type="dxa"/>
-              <w:bottom w:w="60" w:type="dxa"/>
-              <w:left w:w="100" w:type="dxa"/>
-              <w:right w:w="100" w:type="dxa"/>
+              <w:top w:w="80" w:type="dxa"/>
+              <w:bottom w:w="80" w:type="dxa"/>
+              <w:left w:w="120" w:type="dxa"/>
+              <w:right w:w="120" w:type="dxa"/>
             </w:tcMar>
           </w:tcPr>
           <w:p>
@@ -1168,7 +1206,7 @@
             <w:r>
               <w:rPr>
                 <w:rFonts w:ascii="Times New Roman" w:hAnsi="Times New Roman"/>
-                <w:sz w:val="18"/>
+                <w:sz w:val="20"/>
               </w:rPr>
               <w:t>0.8471</w:t>
             </w:r>
@@ -1179,10 +1217,10 @@
             <w:tcW w:type="dxa" w:w="1872"/>
             <w:shd w:fill="F8FAFC"/>
             <w:tcMar>
-              <w:top w:w="60" w:type="dxa"/>
-              <w:bottom w:w="60" w:type="dxa"/>
-              <w:left w:w="100" w:type="dxa"/>
-              <w:right w:w="100" w:type="dxa"/>
+              <w:top w:w="80" w:type="dxa"/>
+              <w:bottom w:w="80" w:type="dxa"/>
+              <w:left w:w="120" w:type="dxa"/>
+              <w:right w:w="120" w:type="dxa"/>
             </w:tcMar>
           </w:tcPr>
           <w:p>
@@ -1192,7 +1230,7 @@
             <w:r>
               <w:rPr>
                 <w:rFonts w:ascii="Times New Roman" w:hAnsi="Times New Roman"/>
-                <w:sz w:val="18"/>
+                <w:sz w:val="20"/>
               </w:rPr>
               <w:t>0.8471</w:t>
             </w:r>
@@ -1203,10 +1241,10 @@
             <w:tcW w:type="dxa" w:w="1872"/>
             <w:shd w:fill="F8FAFC"/>
             <w:tcMar>
-              <w:top w:w="60" w:type="dxa"/>
-              <w:bottom w:w="60" w:type="dxa"/>
-              <w:left w:w="100" w:type="dxa"/>
-              <w:right w:w="100" w:type="dxa"/>
+              <w:top w:w="80" w:type="dxa"/>
+              <w:bottom w:w="80" w:type="dxa"/>
+              <w:left w:w="120" w:type="dxa"/>
+              <w:right w:w="120" w:type="dxa"/>
             </w:tcMar>
           </w:tcPr>
           <w:p>
@@ -1216,7 +1254,7 @@
             <w:r>
               <w:rPr>
                 <w:rFonts w:ascii="Times New Roman" w:hAnsi="Times New Roman"/>
-                <w:sz w:val="18"/>
+                <w:sz w:val="20"/>
               </w:rPr>
               <w:t>0.8650</w:t>
             </w:r>
@@ -1229,10 +1267,10 @@
             <w:tcW w:type="dxa" w:w="2592"/>
             <w:shd w:fill="FFFFFF"/>
             <w:tcMar>
-              <w:top w:w="60" w:type="dxa"/>
-              <w:bottom w:w="60" w:type="dxa"/>
-              <w:left w:w="100" w:type="dxa"/>
-              <w:right w:w="100" w:type="dxa"/>
+              <w:top w:w="80" w:type="dxa"/>
+              <w:bottom w:w="80" w:type="dxa"/>
+              <w:left w:w="120" w:type="dxa"/>
+              <w:right w:w="120" w:type="dxa"/>
             </w:tcMar>
           </w:tcPr>
           <w:p>
@@ -1242,7 +1280,7 @@
             <w:r>
               <w:rPr>
                 <w:rFonts w:ascii="Times New Roman" w:hAnsi="Times New Roman"/>
-                <w:sz w:val="18"/>
+                <w:sz w:val="20"/>
               </w:rPr>
               <w:t>Inference Latency</w:t>
             </w:r>
@@ -1253,10 +1291,10 @@
             <w:tcW w:type="dxa" w:w="1872"/>
             <w:shd w:fill="FFFFFF"/>
             <w:tcMar>
-              <w:top w:w="60" w:type="dxa"/>
-              <w:bottom w:w="60" w:type="dxa"/>
-              <w:left w:w="100" w:type="dxa"/>
-              <w:right w:w="100" w:type="dxa"/>
+              <w:top w:w="80" w:type="dxa"/>
+              <w:bottom w:w="80" w:type="dxa"/>
+              <w:left w:w="120" w:type="dxa"/>
+              <w:right w:w="120" w:type="dxa"/>
             </w:tcMar>
           </w:tcPr>
           <w:p>
@@ -1266,7 +1304,7 @@
             <w:r>
               <w:rPr>
                 <w:rFonts w:ascii="Times New Roman" w:hAnsi="Times New Roman"/>
-                <w:sz w:val="18"/>
+                <w:sz w:val="20"/>
               </w:rPr>
               <w:t>157.66 ms</w:t>
             </w:r>
@@ -1277,10 +1315,10 @@
             <w:tcW w:type="dxa" w:w="1872"/>
             <w:shd w:fill="FFFFFF"/>
             <w:tcMar>
-              <w:top w:w="60" w:type="dxa"/>
-              <w:bottom w:w="60" w:type="dxa"/>
-              <w:left w:w="100" w:type="dxa"/>
-              <w:right w:w="100" w:type="dxa"/>
+              <w:top w:w="80" w:type="dxa"/>
+              <w:bottom w:w="80" w:type="dxa"/>
+              <w:left w:w="120" w:type="dxa"/>
+              <w:right w:w="120" w:type="dxa"/>
             </w:tcMar>
           </w:tcPr>
           <w:p>
@@ -1290,7 +1328,7 @@
             <w:r>
               <w:rPr>
                 <w:rFonts w:ascii="Times New Roman" w:hAnsi="Times New Roman"/>
-                <w:sz w:val="18"/>
+                <w:sz w:val="20"/>
               </w:rPr>
               <w:t>35.60 ms</w:t>
             </w:r>
@@ -1301,10 +1339,10 @@
             <w:tcW w:type="dxa" w:w="1872"/>
             <w:shd w:fill="FFFFFF"/>
             <w:tcMar>
-              <w:top w:w="60" w:type="dxa"/>
-              <w:bottom w:w="60" w:type="dxa"/>
-              <w:left w:w="100" w:type="dxa"/>
-              <w:right w:w="100" w:type="dxa"/>
+              <w:top w:w="80" w:type="dxa"/>
+              <w:bottom w:w="80" w:type="dxa"/>
+              <w:left w:w="120" w:type="dxa"/>
+              <w:right w:w="120" w:type="dxa"/>
             </w:tcMar>
           </w:tcPr>
           <w:p>
@@ -1314,7 +1352,7 @@
             <w:r>
               <w:rPr>
                 <w:rFonts w:ascii="Times New Roman" w:hAnsi="Times New Roman"/>
-                <w:sz w:val="18"/>
+                <w:sz w:val="20"/>
               </w:rPr>
               <w:t>0.76 ms</w:t>
             </w:r>
@@ -1325,10 +1363,10 @@
             <w:tcW w:type="dxa" w:w="1872"/>
             <w:shd w:fill="FFFFFF"/>
             <w:tcMar>
-              <w:top w:w="60" w:type="dxa"/>
-              <w:bottom w:w="60" w:type="dxa"/>
-              <w:left w:w="100" w:type="dxa"/>
-              <w:right w:w="100" w:type="dxa"/>
+              <w:top w:w="80" w:type="dxa"/>
+              <w:bottom w:w="80" w:type="dxa"/>
+              <w:left w:w="120" w:type="dxa"/>
+              <w:right w:w="120" w:type="dxa"/>
             </w:tcMar>
           </w:tcPr>
           <w:p>
@@ -1338,7 +1376,7 @@
             <w:r>
               <w:rPr>
                 <w:rFonts w:ascii="Times New Roman" w:hAnsi="Times New Roman"/>
-                <w:sz w:val="18"/>
+                <w:sz w:val="20"/>
               </w:rPr>
               <w:t>0.12 ms</w:t>
             </w:r>
@@ -1351,10 +1389,10 @@
             <w:tcW w:type="dxa" w:w="2592"/>
             <w:shd w:fill="F8FAFC"/>
             <w:tcMar>
-              <w:top w:w="60" w:type="dxa"/>
-              <w:bottom w:w="60" w:type="dxa"/>
-              <w:left w:w="100" w:type="dxa"/>
-              <w:right w:w="100" w:type="dxa"/>
+              <w:top w:w="80" w:type="dxa"/>
+              <w:bottom w:w="80" w:type="dxa"/>
+              <w:left w:w="120" w:type="dxa"/>
+              <w:right w:w="120" w:type="dxa"/>
             </w:tcMar>
           </w:tcPr>
           <w:p>
@@ -1364,7 +1402,7 @@
             <w:r>
               <w:rPr>
                 <w:rFonts w:ascii="Times New Roman" w:hAnsi="Times New Roman"/>
-                <w:sz w:val="18"/>
+                <w:sz w:val="20"/>
               </w:rPr>
               <w:t>Model Size</w:t>
             </w:r>
@@ -1375,10 +1413,10 @@
             <w:tcW w:type="dxa" w:w="1872"/>
             <w:shd w:fill="F8FAFC"/>
             <w:tcMar>
-              <w:top w:w="60" w:type="dxa"/>
-              <w:bottom w:w="60" w:type="dxa"/>
-              <w:left w:w="100" w:type="dxa"/>
-              <w:right w:w="100" w:type="dxa"/>
+              <w:top w:w="80" w:type="dxa"/>
+              <w:bottom w:w="80" w:type="dxa"/>
+              <w:left w:w="120" w:type="dxa"/>
+              <w:right w:w="120" w:type="dxa"/>
             </w:tcMar>
           </w:tcPr>
           <w:p>
@@ -1388,7 +1426,7 @@
             <w:r>
               <w:rPr>
                 <w:rFonts w:ascii="Times New Roman" w:hAnsi="Times New Roman"/>
-                <w:sz w:val="18"/>
+                <w:sz w:val="20"/>
               </w:rPr>
               <w:t>1.86 MB</w:t>
             </w:r>
@@ -1399,10 +1437,10 @@
             <w:tcW w:type="dxa" w:w="1872"/>
             <w:shd w:fill="F8FAFC"/>
             <w:tcMar>
-              <w:top w:w="60" w:type="dxa"/>
-              <w:bottom w:w="60" w:type="dxa"/>
-              <w:left w:w="100" w:type="dxa"/>
-              <w:right w:w="100" w:type="dxa"/>
+              <w:top w:w="80" w:type="dxa"/>
+              <w:bottom w:w="80" w:type="dxa"/>
+              <w:left w:w="120" w:type="dxa"/>
+              <w:right w:w="120" w:type="dxa"/>
             </w:tcMar>
           </w:tcPr>
           <w:p>
@@ -1412,7 +1450,7 @@
             <w:r>
               <w:rPr>
                 <w:rFonts w:ascii="Times New Roman" w:hAnsi="Times New Roman"/>
-                <w:sz w:val="18"/>
+                <w:sz w:val="20"/>
               </w:rPr>
               <w:t>4.88 MB</w:t>
             </w:r>
@@ -1423,10 +1461,10 @@
             <w:tcW w:type="dxa" w:w="1872"/>
             <w:shd w:fill="F8FAFC"/>
             <w:tcMar>
-              <w:top w:w="60" w:type="dxa"/>
-              <w:bottom w:w="60" w:type="dxa"/>
-              <w:left w:w="100" w:type="dxa"/>
-              <w:right w:w="100" w:type="dxa"/>
+              <w:top w:w="80" w:type="dxa"/>
+              <w:bottom w:w="80" w:type="dxa"/>
+              <w:left w:w="120" w:type="dxa"/>
+              <w:right w:w="120" w:type="dxa"/>
             </w:tcMar>
           </w:tcPr>
           <w:p>
@@ -1436,7 +1474,7 @@
             <w:r>
               <w:rPr>
                 <w:rFonts w:ascii="Times New Roman" w:hAnsi="Times New Roman"/>
-                <w:sz w:val="18"/>
+                <w:sz w:val="20"/>
               </w:rPr>
               <w:t>0.82 MB</w:t>
             </w:r>
@@ -1447,10 +1485,10 @@
             <w:tcW w:type="dxa" w:w="1872"/>
             <w:shd w:fill="F8FAFC"/>
             <w:tcMar>
-              <w:top w:w="60" w:type="dxa"/>
-              <w:bottom w:w="60" w:type="dxa"/>
-              <w:left w:w="100" w:type="dxa"/>
-              <w:right w:w="100" w:type="dxa"/>
+              <w:top w:w="80" w:type="dxa"/>
+              <w:bottom w:w="80" w:type="dxa"/>
+              <w:left w:w="120" w:type="dxa"/>
+              <w:right w:w="120" w:type="dxa"/>
             </w:tcMar>
           </w:tcPr>
           <w:p>
@@ -1460,7 +1498,7 @@
             <w:r>
               <w:rPr>
                 <w:rFonts w:ascii="Times New Roman" w:hAnsi="Times New Roman"/>
-                <w:sz w:val="18"/>
+                <w:sz w:val="20"/>
               </w:rPr>
               <w:t>1.76 MB</w:t>
             </w:r>
@@ -1473,10 +1511,10 @@
             <w:tcW w:type="dxa" w:w="2592"/>
             <w:shd w:fill="FFFFFF"/>
             <w:tcMar>
-              <w:top w:w="60" w:type="dxa"/>
-              <w:bottom w:w="60" w:type="dxa"/>
-              <w:left w:w="100" w:type="dxa"/>
-              <w:right w:w="100" w:type="dxa"/>
+              <w:top w:w="80" w:type="dxa"/>
+              <w:bottom w:w="80" w:type="dxa"/>
+              <w:left w:w="120" w:type="dxa"/>
+              <w:right w:w="120" w:type="dxa"/>
             </w:tcMar>
           </w:tcPr>
           <w:p>
@@ -1486,7 +1524,7 @@
             <w:r>
               <w:rPr>
                 <w:rFonts w:ascii="Times New Roman" w:hAnsi="Times New Roman"/>
-                <w:sz w:val="18"/>
+                <w:sz w:val="20"/>
               </w:rPr>
               <w:t>SCADA Compliance</w:t>
             </w:r>
@@ -1497,10 +1535,10 @@
             <w:tcW w:type="dxa" w:w="1872"/>
             <w:shd w:fill="FFFFFF"/>
             <w:tcMar>
-              <w:top w:w="60" w:type="dxa"/>
-              <w:bottom w:w="60" w:type="dxa"/>
-              <w:left w:w="100" w:type="dxa"/>
-              <w:right w:w="100" w:type="dxa"/>
+              <w:top w:w="80" w:type="dxa"/>
+              <w:bottom w:w="80" w:type="dxa"/>
+              <w:left w:w="120" w:type="dxa"/>
+              <w:right w:w="120" w:type="dxa"/>
             </w:tcMar>
           </w:tcPr>
           <w:p>
@@ -1510,7 +1548,7 @@
             <w:r>
               <w:rPr>
                 <w:rFonts w:ascii="Times New Roman" w:hAnsi="Times New Roman"/>
-                <w:sz w:val="18"/>
+                <w:sz w:val="20"/>
               </w:rPr>
               <w:t>FAIL (&gt;100ms)</w:t>
             </w:r>
@@ -1521,10 +1559,10 @@
             <w:tcW w:type="dxa" w:w="1872"/>
             <w:shd w:fill="FFFFFF"/>
             <w:tcMar>
-              <w:top w:w="60" w:type="dxa"/>
-              <w:bottom w:w="60" w:type="dxa"/>
-              <w:left w:w="100" w:type="dxa"/>
-              <w:right w:w="100" w:type="dxa"/>
+              <w:top w:w="80" w:type="dxa"/>
+              <w:bottom w:w="80" w:type="dxa"/>
+              <w:left w:w="120" w:type="dxa"/>
+              <w:right w:w="120" w:type="dxa"/>
             </w:tcMar>
           </w:tcPr>
           <w:p>
@@ -1536,7 +1574,7 @@
                 <w:rFonts w:ascii="Times New Roman" w:hAnsi="Times New Roman"/>
                 <w:b/>
                 <w:color w:val="10B981"/>
-                <w:sz w:val="18"/>
+                <w:sz w:val="20"/>
               </w:rPr>
               <w:t>PASS (&lt;100ms)</w:t>
             </w:r>
@@ -1547,10 +1585,10 @@
             <w:tcW w:type="dxa" w:w="1872"/>
             <w:shd w:fill="FFFFFF"/>
             <w:tcMar>
-              <w:top w:w="60" w:type="dxa"/>
-              <w:bottom w:w="60" w:type="dxa"/>
-              <w:left w:w="100" w:type="dxa"/>
-              <w:right w:w="100" w:type="dxa"/>
+              <w:top w:w="80" w:type="dxa"/>
+              <w:bottom w:w="80" w:type="dxa"/>
+              <w:left w:w="120" w:type="dxa"/>
+              <w:right w:w="120" w:type="dxa"/>
             </w:tcMar>
           </w:tcPr>
           <w:p>
@@ -1562,7 +1600,7 @@
                 <w:rFonts w:ascii="Times New Roman" w:hAnsi="Times New Roman"/>
                 <w:b/>
                 <w:color w:val="10B981"/>
-                <w:sz w:val="18"/>
+                <w:sz w:val="20"/>
               </w:rPr>
               <w:t>PASS (&lt;100ms)</w:t>
             </w:r>
@@ -1573,10 +1611,10 @@
             <w:tcW w:type="dxa" w:w="1872"/>
             <w:shd w:fill="FFFFFF"/>
             <w:tcMar>
-              <w:top w:w="60" w:type="dxa"/>
-              <w:bottom w:w="60" w:type="dxa"/>
-              <w:left w:w="100" w:type="dxa"/>
-              <w:right w:w="100" w:type="dxa"/>
+              <w:top w:w="80" w:type="dxa"/>
+              <w:bottom w:w="80" w:type="dxa"/>
+              <w:left w:w="120" w:type="dxa"/>
+              <w:right w:w="120" w:type="dxa"/>
             </w:tcMar>
           </w:tcPr>
           <w:p>
@@ -1588,7 +1626,7 @@
                 <w:rFonts w:ascii="Times New Roman" w:hAnsi="Times New Roman"/>
                 <w:b/>
                 <w:color w:val="10B981"/>
-                <w:sz w:val="18"/>
+                <w:sz w:val="20"/>
               </w:rPr>
               <w:t>PASS (&lt;100ms)</w:t>
             </w:r>
@@ -1603,7 +1641,7 @@
     </w:p>
     <w:p>
       <w:pPr>
-        <w:spacing w:before="120" w:after="40"/>
+        <w:spacing w:before="160" w:after="40"/>
         <w:jc w:val="center"/>
       </w:pPr>
       <w:r>
@@ -1643,22 +1681,22 @@
     </w:p>
     <w:p>
       <w:pPr>
-        <w:spacing w:after="160"/>
+        <w:spacing w:after="200"/>
         <w:jc w:val="center"/>
       </w:pPr>
       <w:r>
         <w:rPr>
           <w:rFonts w:ascii="Times New Roman" w:hAnsi="Times New Roman"/>
           <w:i/>
-          <w:color w:val="475569"/>
-          <w:sz w:val="18"/>
+          <w:color w:val="64748B"/>
+          <w:sz w:val="20"/>
         </w:rPr>
         <w:t>Figure 4.1: Confusion Matrix on NSL-KDD Held-Out Test Set (22,544 Samples)</w:t>
       </w:r>
     </w:p>
     <w:p>
       <w:pPr>
-        <w:spacing w:before="120" w:after="40"/>
+        <w:spacing w:before="160" w:after="40"/>
         <w:jc w:val="center"/>
       </w:pPr>
       <w:r>
@@ -1698,15 +1736,15 @@
     </w:p>
     <w:p>
       <w:pPr>
-        <w:spacing w:after="160"/>
+        <w:spacing w:after="200"/>
         <w:jc w:val="center"/>
       </w:pPr>
       <w:r>
         <w:rPr>
           <w:rFonts w:ascii="Times New Roman" w:hAnsi="Times New Roman"/>
           <w:i/>
-          <w:color w:val="475569"/>
-          <w:sz w:val="18"/>
+          <w:color w:val="64748B"/>
+          <w:sz w:val="20"/>
         </w:rPr>
         <w:t>Figure 4.2: Latency Profile Comparison across IDS Implementations</w:t>
       </w:r>
@@ -1721,7 +1759,7 @@
           <w:rFonts w:ascii="Arial" w:hAnsi="Arial"/>
           <w:b/>
           <w:color w:val="00529B"/>
-          <w:sz w:val="27"/>
+          <w:sz w:val="28"/>
         </w:rPr>
         <w:t>APPENDICES</w:t>
       </w:r>
@@ -1735,8 +1773,8 @@
         <w:rPr>
           <w:rFonts w:ascii="Arial" w:hAnsi="Arial"/>
           <w:b/>
-          <w:color w:val="0F172A"/>
-          <w:sz w:val="23"/>
+          <w:color w:val="1E293B"/>
+          <w:sz w:val="25"/>
         </w:rPr>
         <w:t>APPENDIX A: BWOA Optimization Pseudocode</w:t>
       </w:r>
@@ -1746,6 +1784,14 @@
         <w:tblW w:type="auto" w:w="0"/>
         <w:jc w:val="center"/>
         <w:tblLook w:firstColumn="1" w:firstRow="1" w:lastColumn="0" w:lastRow="0" w:noHBand="0" w:noVBand="1" w:val="04A0"/>
+        <w:tblBorders>
+          <w:top w:val="single" w:sz="6" w:space="0" w:color="334155"/>
+          <w:bottom w:val="single" w:sz="6" w:space="0" w:color="334155"/>
+          <w:left w:val="single" w:sz="6" w:space="0" w:color="334155"/>
+          <w:right w:val="single" w:sz="6" w:space="0" w:color="334155"/>
+          <w:insideH w:val="single" w:sz="6" w:space="0" w:color="334155"/>
+          <w:insideV w:val="single" w:sz="6" w:space="0" w:color="334155"/>
+        </w:tblBorders>
       </w:tblPr>
       <w:tblGrid>
         <w:gridCol w:w="9360"/>
@@ -1764,13 +1810,13 @@
           </w:tcPr>
           <w:p>
             <w:pPr>
-              <w:spacing w:after="40"/>
+              <w:spacing w:after="40" w:line="276" w:lineRule="auto"/>
             </w:pPr>
             <w:r>
               <w:rPr>
                 <w:rFonts w:ascii="Consolas" w:hAnsi="Consolas"/>
                 <w:color w:val="E2E8F0"/>
-                <w:sz w:val="17"/>
+                <w:sz w:val="18"/>
               </w:rPr>
               <w:t>Algorithm 1: Binary Whale Optimization Algorithm (BWOA) with Accuracy Floor</w:t>
               <w:br/>
@@ -1778,7 +1824,7 @@
               <w:br/>
               <w:t>Input : Feature matrix X in R^{N x D}, labels y in {0, ..., C-1}</w:t>
               <w:br/>
-              <w:t xml:space="preserve">        Parameters: n_agents=30, max_iter=100, alpha=0.3, min_acc=0.75</w:t>
+              <w:t xml:space="preserve"> Parameters: n_agents=30, max_iter=100, alpha=0.3, min_acc=0.75</w:t>
               <w:br/>
               <w:t>Output: Best binary feature mask X_best in {0, 1}^D</w:t>
               <w:br/>
@@ -1791,47 +1837,47 @@
               <w:br/>
               <w:t>4. while t &lt; max_iter do:</w:t>
               <w:br/>
-              <w:t>5.     a = 2 - 2 * (t / max_iter)  // Linear parameter decay</w:t>
+              <w:t>5. a = 2 - 2 * (t / max_iter) // Linear parameter decay</w:t>
               <w:br/>
-              <w:t>6.     for each agent i do:</w:t>
+              <w:t>6. for each agent i do:</w:t>
               <w:br/>
-              <w:t>7.         p = rand(), r1 = rand(), r2 = rand(), l = rand(-1, 1)</w:t>
+              <w:t>7. p = rand(), r1 = rand(), r2 = rand(), l = rand(-1, 1)</w:t>
               <w:br/>
-              <w:t>8.         A = 2 * a * r1 - a,  C = 2 * r2</w:t>
+              <w:t>8. A = 2 * a * r1 - a, C = 2 * r2</w:t>
               <w:br/>
-              <w:t>9.         if p &lt; 0.5 then:</w:t>
+              <w:t>9. if p &lt; 0.5 then:</w:t>
               <w:br/>
-              <w:t>10.            if |A| &lt; 1 then:</w:t>
+              <w:t>10. if |A| &lt; 1 then:</w:t>
               <w:br/>
-              <w:t>11.                D_vec = |C * X_best - X_i|</w:t>
+              <w:t>11. D_vec = |C * X_best - X_i|</w:t>
               <w:br/>
-              <w:t>12.                X_cont = X_best - A * D_vec  // Shrinking encircling</w:t>
+              <w:t>12. X_cont = X_best - A * D_vec // Shrinking encircling</w:t>
               <w:br/>
-              <w:t>13.            else:</w:t>
+              <w:t>13. else:</w:t>
               <w:br/>
-              <w:t>14.                X_rand = select_random_whale()</w:t>
+              <w:t>14. X_rand = select_random_whale()</w:t>
               <w:br/>
-              <w:t>15.                D_vec = |C * X_rand - X_i|</w:t>
+              <w:t>15. D_vec = |C * X_rand - X_i|</w:t>
               <w:br/>
-              <w:t>16.                X_cont = X_rand - A * D_vec  // Exploration</w:t>
+              <w:t>16. X_cont = X_rand - A * D_vec // Exploration</w:t>
               <w:br/>
-              <w:t>17.        else:</w:t>
+              <w:t>17. else:</w:t>
               <w:br/>
-              <w:t>18.            D_prime = |X_best - X_i|</w:t>
+              <w:t>18. D_prime = |X_best - X_i|</w:t>
               <w:br/>
-              <w:t>19.            X_cont = D_prime * exp(b * l) * cos(2 * pi * l) + X_best  // Spiral search</w:t>
+              <w:t>19. X_cont = D_prime * exp(b * l) * cos(2 * pi * l) + X_best // Spiral search</w:t>
               <w:br/>
-              <w:t>20.        // Apply V-shaped binary transfer function</w:t>
+              <w:t>20. // Apply V-shaped binary transfer function</w:t>
               <w:br/>
-              <w:t>21.        for each dimension d do:</w:t>
+              <w:t>21. for each dimension d do:</w:t>
               <w:br/>
-              <w:t>22.            V_val = |X_cont[d] / sqrt(1 + X_cont[d]^2)|</w:t>
+              <w:t>22. V_val = |X_cont[d] / sqrt(1 + X_cont[d]^2)|</w:t>
               <w:br/>
-              <w:t>23.            if rand() &lt; V_val then X_i[d] = 1 - X_i[d]</w:t>
+              <w:t>23. if rand() &lt; V_val then X_i[d] = 1 - X_i[d]</w:t>
               <w:br/>
-              <w:t>24.        Re-evaluate fitness Fit_i and update X_best</w:t>
+              <w:t>24. Re-evaluate fitness Fit_i and update X_best</w:t>
               <w:br/>
-              <w:t>25.    t = t + 1</w:t>
+              <w:t>25. t = t + 1</w:t>
               <w:br/>
               <w:t>26. return X_best</w:t>
             </w:r>
@@ -1853,8 +1899,8 @@
         <w:rPr>
           <w:rFonts w:ascii="Arial" w:hAnsi="Arial"/>
           <w:b/>
-          <w:color w:val="0F172A"/>
-          <w:sz w:val="23"/>
+          <w:color w:val="1E293B"/>
+          <w:sz w:val="25"/>
         </w:rPr>
         <w:t>APPENDIX B: CNN-LSTM Hyperparameters &amp; Architecture Specifications</w:t>
       </w:r>
@@ -1865,6 +1911,14 @@
         <w:jc w:val="center"/>
         <w:tblLayout w:type="fixed"/>
         <w:tblLook w:firstColumn="1" w:firstRow="1" w:lastColumn="0" w:lastRow="0" w:noHBand="0" w:noVBand="1" w:val="04A0"/>
+        <w:tblBorders>
+          <w:top w:val="single" w:sz="4" w:space="0" w:color="CBD5E1"/>
+          <w:bottom w:val="single" w:sz="4" w:space="0" w:color="CBD5E1"/>
+          <w:left w:val="single" w:sz="4" w:space="0" w:color="CBD5E1"/>
+          <w:right w:val="single" w:sz="4" w:space="0" w:color="CBD5E1"/>
+          <w:insideH w:val="single" w:sz="4" w:space="0" w:color="CBD5E1"/>
+          <w:insideV w:val="single" w:sz="4" w:space="0" w:color="CBD5E1"/>
+        </w:tblBorders>
       </w:tblPr>
       <w:tblGrid>
         <w:gridCol w:w="1872"/>
@@ -1879,10 +1933,10 @@
             <w:tcW w:type="dxa" w:w="2160"/>
             <w:shd w:fill="00529B"/>
             <w:tcMar>
-              <w:top w:w="100" w:type="dxa"/>
-              <w:bottom w:w="100" w:type="dxa"/>
-              <w:left w:w="120" w:type="dxa"/>
-              <w:right w:w="120" w:type="dxa"/>
+              <w:top w:w="120" w:type="dxa"/>
+              <w:bottom w:w="120" w:type="dxa"/>
+              <w:left w:w="140" w:type="dxa"/>
+              <w:right w:w="140" w:type="dxa"/>
             </w:tcMar>
           </w:tcPr>
           <w:p>
@@ -1894,7 +1948,7 @@
                 <w:rFonts w:ascii="Arial" w:hAnsi="Arial"/>
                 <w:b/>
                 <w:color w:val="FFFFFF"/>
-                <w:sz w:val="18"/>
+                <w:sz w:val="20"/>
               </w:rPr>
               <w:t>Layer Type</w:t>
             </w:r>
@@ -1905,10 +1959,10 @@
             <w:tcW w:type="dxa" w:w="1728"/>
             <w:shd w:fill="00529B"/>
             <w:tcMar>
-              <w:top w:w="100" w:type="dxa"/>
-              <w:bottom w:w="100" w:type="dxa"/>
-              <w:left w:w="120" w:type="dxa"/>
-              <w:right w:w="120" w:type="dxa"/>
+              <w:top w:w="120" w:type="dxa"/>
+              <w:bottom w:w="120" w:type="dxa"/>
+              <w:left w:w="140" w:type="dxa"/>
+              <w:right w:w="140" w:type="dxa"/>
             </w:tcMar>
           </w:tcPr>
           <w:p>
@@ -1920,7 +1974,7 @@
                 <w:rFonts w:ascii="Arial" w:hAnsi="Arial"/>
                 <w:b/>
                 <w:color w:val="FFFFFF"/>
-                <w:sz w:val="18"/>
+                <w:sz w:val="20"/>
               </w:rPr>
               <w:t>Output Shape</w:t>
             </w:r>
@@ -1931,10 +1985,10 @@
             <w:tcW w:type="dxa" w:w="1440"/>
             <w:shd w:fill="00529B"/>
             <w:tcMar>
-              <w:top w:w="100" w:type="dxa"/>
-              <w:bottom w:w="100" w:type="dxa"/>
-              <w:left w:w="120" w:type="dxa"/>
-              <w:right w:w="120" w:type="dxa"/>
+              <w:top w:w="120" w:type="dxa"/>
+              <w:bottom w:w="120" w:type="dxa"/>
+              <w:left w:w="140" w:type="dxa"/>
+              <w:right w:w="140" w:type="dxa"/>
             </w:tcMar>
           </w:tcPr>
           <w:p>
@@ -1946,7 +2000,7 @@
                 <w:rFonts w:ascii="Arial" w:hAnsi="Arial"/>
                 <w:b/>
                 <w:color w:val="FFFFFF"/>
-                <w:sz w:val="18"/>
+                <w:sz w:val="20"/>
               </w:rPr>
               <w:t>Param Count</w:t>
             </w:r>
@@ -1957,10 +2011,10 @@
             <w:tcW w:type="dxa" w:w="1440"/>
             <w:shd w:fill="00529B"/>
             <w:tcMar>
-              <w:top w:w="100" w:type="dxa"/>
-              <w:bottom w:w="100" w:type="dxa"/>
-              <w:left w:w="120" w:type="dxa"/>
-              <w:right w:w="120" w:type="dxa"/>
+              <w:top w:w="120" w:type="dxa"/>
+              <w:bottom w:w="120" w:type="dxa"/>
+              <w:left w:w="140" w:type="dxa"/>
+              <w:right w:w="140" w:type="dxa"/>
             </w:tcMar>
           </w:tcPr>
           <w:p>
@@ -1972,7 +2026,7 @@
                 <w:rFonts w:ascii="Arial" w:hAnsi="Arial"/>
                 <w:b/>
                 <w:color w:val="FFFFFF"/>
-                <w:sz w:val="18"/>
+                <w:sz w:val="20"/>
               </w:rPr>
               <w:t>Activation</w:t>
             </w:r>
@@ -1983,10 +2037,10 @@
             <w:tcW w:type="dxa" w:w="3312"/>
             <w:shd w:fill="00529B"/>
             <w:tcMar>
-              <w:top w:w="100" w:type="dxa"/>
-              <w:bottom w:w="100" w:type="dxa"/>
-              <w:left w:w="120" w:type="dxa"/>
-              <w:right w:w="120" w:type="dxa"/>
+              <w:top w:w="120" w:type="dxa"/>
+              <w:bottom w:w="120" w:type="dxa"/>
+              <w:left w:w="140" w:type="dxa"/>
+              <w:right w:w="140" w:type="dxa"/>
             </w:tcMar>
           </w:tcPr>
           <w:p>
@@ -1998,7 +2052,7 @@
                 <w:rFonts w:ascii="Arial" w:hAnsi="Arial"/>
                 <w:b/>
                 <w:color w:val="FFFFFF"/>
-                <w:sz w:val="18"/>
+                <w:sz w:val="20"/>
               </w:rPr>
               <w:t>Regularization / Details</w:t>
             </w:r>
@@ -2011,10 +2065,10 @@
             <w:tcW w:type="dxa" w:w="2160"/>
             <w:shd w:fill="FFFFFF"/>
             <w:tcMar>
-              <w:top w:w="60" w:type="dxa"/>
-              <w:bottom w:w="60" w:type="dxa"/>
-              <w:left w:w="100" w:type="dxa"/>
-              <w:right w:w="100" w:type="dxa"/>
+              <w:top w:w="80" w:type="dxa"/>
+              <w:bottom w:w="80" w:type="dxa"/>
+              <w:left w:w="120" w:type="dxa"/>
+              <w:right w:w="120" w:type="dxa"/>
             </w:tcMar>
           </w:tcPr>
           <w:p>
@@ -2024,7 +2078,7 @@
             <w:r>
               <w:rPr>
                 <w:rFonts w:ascii="Times New Roman" w:hAnsi="Times New Roman"/>
-                <w:sz w:val="18"/>
+                <w:sz w:val="20"/>
               </w:rPr>
               <w:t>Input Layer</w:t>
             </w:r>
@@ -2035,10 +2089,10 @@
             <w:tcW w:type="dxa" w:w="1728"/>
             <w:shd w:fill="FFFFFF"/>
             <w:tcMar>
-              <w:top w:w="60" w:type="dxa"/>
-              <w:bottom w:w="60" w:type="dxa"/>
-              <w:left w:w="100" w:type="dxa"/>
-              <w:right w:w="100" w:type="dxa"/>
+              <w:top w:w="80" w:type="dxa"/>
+              <w:bottom w:w="80" w:type="dxa"/>
+              <w:left w:w="120" w:type="dxa"/>
+              <w:right w:w="120" w:type="dxa"/>
             </w:tcMar>
           </w:tcPr>
           <w:p>
@@ -2048,7 +2102,7 @@
             <w:r>
               <w:rPr>
                 <w:rFonts w:ascii="Times New Roman" w:hAnsi="Times New Roman"/>
-                <w:sz w:val="18"/>
+                <w:sz w:val="20"/>
               </w:rPr>
               <w:t>(None, 10, 1)</w:t>
             </w:r>
@@ -2059,10 +2113,10 @@
             <w:tcW w:type="dxa" w:w="1440"/>
             <w:shd w:fill="FFFFFF"/>
             <w:tcMar>
-              <w:top w:w="60" w:type="dxa"/>
-              <w:bottom w:w="60" w:type="dxa"/>
-              <w:left w:w="100" w:type="dxa"/>
-              <w:right w:w="100" w:type="dxa"/>
+              <w:top w:w="80" w:type="dxa"/>
+              <w:bottom w:w="80" w:type="dxa"/>
+              <w:left w:w="120" w:type="dxa"/>
+              <w:right w:w="120" w:type="dxa"/>
             </w:tcMar>
           </w:tcPr>
           <w:p>
@@ -2072,7 +2126,7 @@
             <w:r>
               <w:rPr>
                 <w:rFonts w:ascii="Times New Roman" w:hAnsi="Times New Roman"/>
-                <w:sz w:val="18"/>
+                <w:sz w:val="20"/>
               </w:rPr>
               <w:t>0</w:t>
             </w:r>
@@ -2083,10 +2137,10 @@
             <w:tcW w:type="dxa" w:w="1440"/>
             <w:shd w:fill="FFFFFF"/>
             <w:tcMar>
-              <w:top w:w="60" w:type="dxa"/>
-              <w:bottom w:w="60" w:type="dxa"/>
-              <w:left w:w="100" w:type="dxa"/>
-              <w:right w:w="100" w:type="dxa"/>
+              <w:top w:w="80" w:type="dxa"/>
+              <w:bottom w:w="80" w:type="dxa"/>
+              <w:left w:w="120" w:type="dxa"/>
+              <w:right w:w="120" w:type="dxa"/>
             </w:tcMar>
           </w:tcPr>
           <w:p>
@@ -2096,7 +2150,7 @@
             <w:r>
               <w:rPr>
                 <w:rFonts w:ascii="Times New Roman" w:hAnsi="Times New Roman"/>
-                <w:sz w:val="18"/>
+                <w:sz w:val="20"/>
               </w:rPr>
               <w:t>-</w:t>
             </w:r>
@@ -2107,10 +2161,10 @@
             <w:tcW w:type="dxa" w:w="3312"/>
             <w:shd w:fill="FFFFFF"/>
             <w:tcMar>
-              <w:top w:w="60" w:type="dxa"/>
-              <w:bottom w:w="60" w:type="dxa"/>
-              <w:left w:w="100" w:type="dxa"/>
-              <w:right w:w="100" w:type="dxa"/>
+              <w:top w:w="80" w:type="dxa"/>
+              <w:bottom w:w="80" w:type="dxa"/>
+              <w:left w:w="120" w:type="dxa"/>
+              <w:right w:w="120" w:type="dxa"/>
             </w:tcMar>
           </w:tcPr>
           <w:p>
@@ -2120,7 +2174,7 @@
             <w:r>
               <w:rPr>
                 <w:rFonts w:ascii="Times New Roman" w:hAnsi="Times New Roman"/>
-                <w:sz w:val="18"/>
+                <w:sz w:val="20"/>
               </w:rPr>
               <w:t>10 BWOA Features reshaped for 1D convolution</w:t>
             </w:r>
@@ -2133,10 +2187,10 @@
             <w:tcW w:type="dxa" w:w="2160"/>
             <w:shd w:fill="F8FAFC"/>
             <w:tcMar>
-              <w:top w:w="60" w:type="dxa"/>
-              <w:bottom w:w="60" w:type="dxa"/>
-              <w:left w:w="100" w:type="dxa"/>
-              <w:right w:w="100" w:type="dxa"/>
+              <w:top w:w="80" w:type="dxa"/>
+              <w:bottom w:w="80" w:type="dxa"/>
+              <w:left w:w="120" w:type="dxa"/>
+              <w:right w:w="120" w:type="dxa"/>
             </w:tcMar>
           </w:tcPr>
           <w:p>
@@ -2146,7 +2200,7 @@
             <w:r>
               <w:rPr>
                 <w:rFonts w:ascii="Times New Roman" w:hAnsi="Times New Roman"/>
-                <w:sz w:val="18"/>
+                <w:sz w:val="20"/>
               </w:rPr>
               <w:t>Conv1D</w:t>
             </w:r>
@@ -2157,10 +2211,10 @@
             <w:tcW w:type="dxa" w:w="1728"/>
             <w:shd w:fill="F8FAFC"/>
             <w:tcMar>
-              <w:top w:w="60" w:type="dxa"/>
-              <w:bottom w:w="60" w:type="dxa"/>
-              <w:left w:w="100" w:type="dxa"/>
-              <w:right w:w="100" w:type="dxa"/>
+              <w:top w:w="80" w:type="dxa"/>
+              <w:bottom w:w="80" w:type="dxa"/>
+              <w:left w:w="120" w:type="dxa"/>
+              <w:right w:w="120" w:type="dxa"/>
             </w:tcMar>
           </w:tcPr>
           <w:p>
@@ -2170,7 +2224,7 @@
             <w:r>
               <w:rPr>
                 <w:rFonts w:ascii="Times New Roman" w:hAnsi="Times New Roman"/>
-                <w:sz w:val="18"/>
+                <w:sz w:val="20"/>
               </w:rPr>
               <w:t>(None, 10, 64)</w:t>
             </w:r>
@@ -2181,10 +2235,10 @@
             <w:tcW w:type="dxa" w:w="1440"/>
             <w:shd w:fill="F8FAFC"/>
             <w:tcMar>
-              <w:top w:w="60" w:type="dxa"/>
-              <w:bottom w:w="60" w:type="dxa"/>
-              <w:left w:w="100" w:type="dxa"/>
-              <w:right w:w="100" w:type="dxa"/>
+              <w:top w:w="80" w:type="dxa"/>
+              <w:bottom w:w="80" w:type="dxa"/>
+              <w:left w:w="120" w:type="dxa"/>
+              <w:right w:w="120" w:type="dxa"/>
             </w:tcMar>
           </w:tcPr>
           <w:p>
@@ -2194,7 +2248,7 @@
             <w:r>
               <w:rPr>
                 <w:rFonts w:ascii="Times New Roman" w:hAnsi="Times New Roman"/>
-                <w:sz w:val="18"/>
+                <w:sz w:val="20"/>
               </w:rPr>
               <w:t>256</w:t>
             </w:r>
@@ -2205,10 +2259,10 @@
             <w:tcW w:type="dxa" w:w="1440"/>
             <w:shd w:fill="F8FAFC"/>
             <w:tcMar>
-              <w:top w:w="60" w:type="dxa"/>
-              <w:bottom w:w="60" w:type="dxa"/>
-              <w:left w:w="100" w:type="dxa"/>
-              <w:right w:w="100" w:type="dxa"/>
+              <w:top w:w="80" w:type="dxa"/>
+              <w:bottom w:w="80" w:type="dxa"/>
+              <w:left w:w="120" w:type="dxa"/>
+              <w:right w:w="120" w:type="dxa"/>
             </w:tcMar>
           </w:tcPr>
           <w:p>
@@ -2218,7 +2272,7 @@
             <w:r>
               <w:rPr>
                 <w:rFonts w:ascii="Times New Roman" w:hAnsi="Times New Roman"/>
-                <w:sz w:val="18"/>
+                <w:sz w:val="20"/>
               </w:rPr>
               <w:t>ReLU</w:t>
             </w:r>
@@ -2229,10 +2283,10 @@
             <w:tcW w:type="dxa" w:w="3312"/>
             <w:shd w:fill="F8FAFC"/>
             <w:tcMar>
-              <w:top w:w="60" w:type="dxa"/>
-              <w:bottom w:w="60" w:type="dxa"/>
-              <w:left w:w="100" w:type="dxa"/>
-              <w:right w:w="100" w:type="dxa"/>
+              <w:top w:w="80" w:type="dxa"/>
+              <w:bottom w:w="80" w:type="dxa"/>
+              <w:left w:w="120" w:type="dxa"/>
+              <w:right w:w="120" w:type="dxa"/>
             </w:tcMar>
           </w:tcPr>
           <w:p>
@@ -2242,7 +2296,7 @@
             <w:r>
               <w:rPr>
                 <w:rFonts w:ascii="Times New Roman" w:hAnsi="Times New Roman"/>
-                <w:sz w:val="18"/>
+                <w:sz w:val="20"/>
               </w:rPr>
               <w:t>Filters=64, Kernel Size=3, Padding='same'</w:t>
             </w:r>
@@ -2255,10 +2309,10 @@
             <w:tcW w:type="dxa" w:w="2160"/>
             <w:shd w:fill="FFFFFF"/>
             <w:tcMar>
-              <w:top w:w="60" w:type="dxa"/>
-              <w:bottom w:w="60" w:type="dxa"/>
-              <w:left w:w="100" w:type="dxa"/>
-              <w:right w:w="100" w:type="dxa"/>
+              <w:top w:w="80" w:type="dxa"/>
+              <w:bottom w:w="80" w:type="dxa"/>
+              <w:left w:w="120" w:type="dxa"/>
+              <w:right w:w="120" w:type="dxa"/>
             </w:tcMar>
           </w:tcPr>
           <w:p>
@@ -2268,7 +2322,7 @@
             <w:r>
               <w:rPr>
                 <w:rFonts w:ascii="Times New Roman" w:hAnsi="Times New Roman"/>
-                <w:sz w:val="18"/>
+                <w:sz w:val="20"/>
               </w:rPr>
               <w:t>BatchNormalization</w:t>
             </w:r>
@@ -2279,10 +2333,10 @@
             <w:tcW w:type="dxa" w:w="1728"/>
             <w:shd w:fill="FFFFFF"/>
             <w:tcMar>
-              <w:top w:w="60" w:type="dxa"/>
-              <w:bottom w:w="60" w:type="dxa"/>
-              <w:left w:w="100" w:type="dxa"/>
-              <w:right w:w="100" w:type="dxa"/>
+              <w:top w:w="80" w:type="dxa"/>
+              <w:bottom w:w="80" w:type="dxa"/>
+              <w:left w:w="120" w:type="dxa"/>
+              <w:right w:w="120" w:type="dxa"/>
             </w:tcMar>
           </w:tcPr>
           <w:p>
@@ -2292,7 +2346,7 @@
             <w:r>
               <w:rPr>
                 <w:rFonts w:ascii="Times New Roman" w:hAnsi="Times New Roman"/>
-                <w:sz w:val="18"/>
+                <w:sz w:val="20"/>
               </w:rPr>
               <w:t>(None, 10, 64)</w:t>
             </w:r>
@@ -2303,10 +2357,10 @@
             <w:tcW w:type="dxa" w:w="1440"/>
             <w:shd w:fill="FFFFFF"/>
             <w:tcMar>
-              <w:top w:w="60" w:type="dxa"/>
-              <w:bottom w:w="60" w:type="dxa"/>
-              <w:left w:w="100" w:type="dxa"/>
-              <w:right w:w="100" w:type="dxa"/>
+              <w:top w:w="80" w:type="dxa"/>
+              <w:bottom w:w="80" w:type="dxa"/>
+              <w:left w:w="120" w:type="dxa"/>
+              <w:right w:w="120" w:type="dxa"/>
             </w:tcMar>
           </w:tcPr>
           <w:p>
@@ -2316,7 +2370,7 @@
             <w:r>
               <w:rPr>
                 <w:rFonts w:ascii="Times New Roman" w:hAnsi="Times New Roman"/>
-                <w:sz w:val="18"/>
+                <w:sz w:val="20"/>
               </w:rPr>
               <w:t>256</w:t>
             </w:r>
@@ -2327,10 +2381,10 @@
             <w:tcW w:type="dxa" w:w="1440"/>
             <w:shd w:fill="FFFFFF"/>
             <w:tcMar>
-              <w:top w:w="60" w:type="dxa"/>
-              <w:bottom w:w="60" w:type="dxa"/>
-              <w:left w:w="100" w:type="dxa"/>
-              <w:right w:w="100" w:type="dxa"/>
+              <w:top w:w="80" w:type="dxa"/>
+              <w:bottom w:w="80" w:type="dxa"/>
+              <w:left w:w="120" w:type="dxa"/>
+              <w:right w:w="120" w:type="dxa"/>
             </w:tcMar>
           </w:tcPr>
           <w:p>
@@ -2340,7 +2394,7 @@
             <w:r>
               <w:rPr>
                 <w:rFonts w:ascii="Times New Roman" w:hAnsi="Times New Roman"/>
-                <w:sz w:val="18"/>
+                <w:sz w:val="20"/>
               </w:rPr>
               <w:t>-</w:t>
             </w:r>
@@ -2351,10 +2405,10 @@
             <w:tcW w:type="dxa" w:w="3312"/>
             <w:shd w:fill="FFFFFF"/>
             <w:tcMar>
-              <w:top w:w="60" w:type="dxa"/>
-              <w:bottom w:w="60" w:type="dxa"/>
-              <w:left w:w="100" w:type="dxa"/>
-              <w:right w:w="100" w:type="dxa"/>
+              <w:top w:w="80" w:type="dxa"/>
+              <w:bottom w:w="80" w:type="dxa"/>
+              <w:left w:w="120" w:type="dxa"/>
+              <w:right w:w="120" w:type="dxa"/>
             </w:tcMar>
           </w:tcPr>
           <w:p>
@@ -2364,7 +2418,7 @@
             <w:r>
               <w:rPr>
                 <w:rFonts w:ascii="Times New Roman" w:hAnsi="Times New Roman"/>
-                <w:sz w:val="18"/>
+                <w:sz w:val="20"/>
               </w:rPr>
               <w:t>Normalizes activations across mini-batches</w:t>
             </w:r>
@@ -2377,10 +2431,10 @@
             <w:tcW w:type="dxa" w:w="2160"/>
             <w:shd w:fill="F8FAFC"/>
             <w:tcMar>
-              <w:top w:w="60" w:type="dxa"/>
-              <w:bottom w:w="60" w:type="dxa"/>
-              <w:left w:w="100" w:type="dxa"/>
-              <w:right w:w="100" w:type="dxa"/>
+              <w:top w:w="80" w:type="dxa"/>
+              <w:bottom w:w="80" w:type="dxa"/>
+              <w:left w:w="120" w:type="dxa"/>
+              <w:right w:w="120" w:type="dxa"/>
             </w:tcMar>
           </w:tcPr>
           <w:p>
@@ -2390,7 +2444,7 @@
             <w:r>
               <w:rPr>
                 <w:rFonts w:ascii="Times New Roman" w:hAnsi="Times New Roman"/>
-                <w:sz w:val="18"/>
+                <w:sz w:val="20"/>
               </w:rPr>
               <w:t>Spatial Dropout</w:t>
             </w:r>
@@ -2401,10 +2455,10 @@
             <w:tcW w:type="dxa" w:w="1728"/>
             <w:shd w:fill="F8FAFC"/>
             <w:tcMar>
-              <w:top w:w="60" w:type="dxa"/>
-              <w:bottom w:w="60" w:type="dxa"/>
-              <w:left w:w="100" w:type="dxa"/>
-              <w:right w:w="100" w:type="dxa"/>
+              <w:top w:w="80" w:type="dxa"/>
+              <w:bottom w:w="80" w:type="dxa"/>
+              <w:left w:w="120" w:type="dxa"/>
+              <w:right w:w="120" w:type="dxa"/>
             </w:tcMar>
           </w:tcPr>
           <w:p>
@@ -2414,7 +2468,7 @@
             <w:r>
               <w:rPr>
                 <w:rFonts w:ascii="Times New Roman" w:hAnsi="Times New Roman"/>
-                <w:sz w:val="18"/>
+                <w:sz w:val="20"/>
               </w:rPr>
               <w:t>(None, 10, 64)</w:t>
             </w:r>
@@ -2425,10 +2479,10 @@
             <w:tcW w:type="dxa" w:w="1440"/>
             <w:shd w:fill="F8FAFC"/>
             <w:tcMar>
-              <w:top w:w="60" w:type="dxa"/>
-              <w:bottom w:w="60" w:type="dxa"/>
-              <w:left w:w="100" w:type="dxa"/>
-              <w:right w:w="100" w:type="dxa"/>
+              <w:top w:w="80" w:type="dxa"/>
+              <w:bottom w:w="80" w:type="dxa"/>
+              <w:left w:w="120" w:type="dxa"/>
+              <w:right w:w="120" w:type="dxa"/>
             </w:tcMar>
           </w:tcPr>
           <w:p>
@@ -2438,7 +2492,7 @@
             <w:r>
               <w:rPr>
                 <w:rFonts w:ascii="Times New Roman" w:hAnsi="Times New Roman"/>
-                <w:sz w:val="18"/>
+                <w:sz w:val="20"/>
               </w:rPr>
               <w:t>0</w:t>
             </w:r>
@@ -2449,10 +2503,10 @@
             <w:tcW w:type="dxa" w:w="1440"/>
             <w:shd w:fill="F8FAFC"/>
             <w:tcMar>
-              <w:top w:w="60" w:type="dxa"/>
-              <w:bottom w:w="60" w:type="dxa"/>
-              <w:left w:w="100" w:type="dxa"/>
-              <w:right w:w="100" w:type="dxa"/>
+              <w:top w:w="80" w:type="dxa"/>
+              <w:bottom w:w="80" w:type="dxa"/>
+              <w:left w:w="120" w:type="dxa"/>
+              <w:right w:w="120" w:type="dxa"/>
             </w:tcMar>
           </w:tcPr>
           <w:p>
@@ -2462,7 +2516,7 @@
             <w:r>
               <w:rPr>
                 <w:rFonts w:ascii="Times New Roman" w:hAnsi="Times New Roman"/>
-                <w:sz w:val="18"/>
+                <w:sz w:val="20"/>
               </w:rPr>
               <w:t>-</w:t>
             </w:r>
@@ -2473,10 +2527,10 @@
             <w:tcW w:type="dxa" w:w="3312"/>
             <w:shd w:fill="F8FAFC"/>
             <w:tcMar>
-              <w:top w:w="60" w:type="dxa"/>
-              <w:bottom w:w="60" w:type="dxa"/>
-              <w:left w:w="100" w:type="dxa"/>
-              <w:right w:w="100" w:type="dxa"/>
+              <w:top w:w="80" w:type="dxa"/>
+              <w:bottom w:w="80" w:type="dxa"/>
+              <w:left w:w="120" w:type="dxa"/>
+              <w:right w:w="120" w:type="dxa"/>
             </w:tcMar>
           </w:tcPr>
           <w:p>
@@ -2486,7 +2540,7 @@
             <w:r>
               <w:rPr>
                 <w:rFonts w:ascii="Times New Roman" w:hAnsi="Times New Roman"/>
-                <w:sz w:val="18"/>
+                <w:sz w:val="20"/>
               </w:rPr>
               <w:t>Dropout Rate = 0.3 to prevent overfitting</w:t>
             </w:r>
@@ -2499,10 +2553,10 @@
             <w:tcW w:type="dxa" w:w="2160"/>
             <w:shd w:fill="FFFFFF"/>
             <w:tcMar>
-              <w:top w:w="60" w:type="dxa"/>
-              <w:bottom w:w="60" w:type="dxa"/>
-              <w:left w:w="100" w:type="dxa"/>
-              <w:right w:w="100" w:type="dxa"/>
+              <w:top w:w="80" w:type="dxa"/>
+              <w:bottom w:w="80" w:type="dxa"/>
+              <w:left w:w="120" w:type="dxa"/>
+              <w:right w:w="120" w:type="dxa"/>
             </w:tcMar>
           </w:tcPr>
           <w:p>
@@ -2512,7 +2566,7 @@
             <w:r>
               <w:rPr>
                 <w:rFonts w:ascii="Times New Roman" w:hAnsi="Times New Roman"/>
-                <w:sz w:val="18"/>
+                <w:sz w:val="20"/>
               </w:rPr>
               <w:t>LSTM Layer</w:t>
             </w:r>
@@ -2523,10 +2577,10 @@
             <w:tcW w:type="dxa" w:w="1728"/>
             <w:shd w:fill="FFFFFF"/>
             <w:tcMar>
-              <w:top w:w="60" w:type="dxa"/>
-              <w:bottom w:w="60" w:type="dxa"/>
-              <w:left w:w="100" w:type="dxa"/>
-              <w:right w:w="100" w:type="dxa"/>
+              <w:top w:w="80" w:type="dxa"/>
+              <w:bottom w:w="80" w:type="dxa"/>
+              <w:left w:w="120" w:type="dxa"/>
+              <w:right w:w="120" w:type="dxa"/>
             </w:tcMar>
           </w:tcPr>
           <w:p>
@@ -2536,7 +2590,7 @@
             <w:r>
               <w:rPr>
                 <w:rFonts w:ascii="Times New Roman" w:hAnsi="Times New Roman"/>
-                <w:sz w:val="18"/>
+                <w:sz w:val="20"/>
               </w:rPr>
               <w:t>(None, 256)</w:t>
             </w:r>
@@ -2547,10 +2601,10 @@
             <w:tcW w:type="dxa" w:w="1440"/>
             <w:shd w:fill="FFFFFF"/>
             <w:tcMar>
-              <w:top w:w="60" w:type="dxa"/>
-              <w:bottom w:w="60" w:type="dxa"/>
-              <w:left w:w="100" w:type="dxa"/>
-              <w:right w:w="100" w:type="dxa"/>
+              <w:top w:w="80" w:type="dxa"/>
+              <w:bottom w:w="80" w:type="dxa"/>
+              <w:left w:w="120" w:type="dxa"/>
+              <w:right w:w="120" w:type="dxa"/>
             </w:tcMar>
           </w:tcPr>
           <w:p>
@@ -2560,7 +2614,7 @@
             <w:r>
               <w:rPr>
                 <w:rFonts w:ascii="Times New Roman" w:hAnsi="Times New Roman"/>
-                <w:sz w:val="18"/>
+                <w:sz w:val="20"/>
               </w:rPr>
               <w:t>328,704</w:t>
             </w:r>
@@ -2571,10 +2625,10 @@
             <w:tcW w:type="dxa" w:w="1440"/>
             <w:shd w:fill="FFFFFF"/>
             <w:tcMar>
-              <w:top w:w="60" w:type="dxa"/>
-              <w:bottom w:w="60" w:type="dxa"/>
-              <w:left w:w="100" w:type="dxa"/>
-              <w:right w:w="100" w:type="dxa"/>
+              <w:top w:w="80" w:type="dxa"/>
+              <w:bottom w:w="80" w:type="dxa"/>
+              <w:left w:w="120" w:type="dxa"/>
+              <w:right w:w="120" w:type="dxa"/>
             </w:tcMar>
           </w:tcPr>
           <w:p>
@@ -2584,7 +2638,7 @@
             <w:r>
               <w:rPr>
                 <w:rFonts w:ascii="Times New Roman" w:hAnsi="Times New Roman"/>
-                <w:sz w:val="18"/>
+                <w:sz w:val="20"/>
               </w:rPr>
               <w:t>Tanh</w:t>
             </w:r>
@@ -2595,10 +2649,10 @@
             <w:tcW w:type="dxa" w:w="3312"/>
             <w:shd w:fill="FFFFFF"/>
             <w:tcMar>
-              <w:top w:w="60" w:type="dxa"/>
-              <w:bottom w:w="60" w:type="dxa"/>
-              <w:left w:w="100" w:type="dxa"/>
-              <w:right w:w="100" w:type="dxa"/>
+              <w:top w:w="80" w:type="dxa"/>
+              <w:bottom w:w="80" w:type="dxa"/>
+              <w:left w:w="120" w:type="dxa"/>
+              <w:right w:w="120" w:type="dxa"/>
             </w:tcMar>
           </w:tcPr>
           <w:p>
@@ -2608,7 +2662,7 @@
             <w:r>
               <w:rPr>
                 <w:rFonts w:ascii="Times New Roman" w:hAnsi="Times New Roman"/>
-                <w:sz w:val="18"/>
+                <w:sz w:val="20"/>
               </w:rPr>
               <w:t>Units=256, Recurrent Activation='sigmoid'</w:t>
             </w:r>
@@ -2621,10 +2675,10 @@
             <w:tcW w:type="dxa" w:w="2160"/>
             <w:shd w:fill="F8FAFC"/>
             <w:tcMar>
-              <w:top w:w="60" w:type="dxa"/>
-              <w:bottom w:w="60" w:type="dxa"/>
-              <w:left w:w="100" w:type="dxa"/>
-              <w:right w:w="100" w:type="dxa"/>
+              <w:top w:w="80" w:type="dxa"/>
+              <w:bottom w:w="80" w:type="dxa"/>
+              <w:left w:w="120" w:type="dxa"/>
+              <w:right w:w="120" w:type="dxa"/>
             </w:tcMar>
           </w:tcPr>
           <w:p>
@@ -2634,7 +2688,7 @@
             <w:r>
               <w:rPr>
                 <w:rFonts w:ascii="Times New Roman" w:hAnsi="Times New Roman"/>
-                <w:sz w:val="18"/>
+                <w:sz w:val="20"/>
               </w:rPr>
               <w:t>Dense (Hidden)</w:t>
             </w:r>
@@ -2645,10 +2699,10 @@
             <w:tcW w:type="dxa" w:w="1728"/>
             <w:shd w:fill="F8FAFC"/>
             <w:tcMar>
-              <w:top w:w="60" w:type="dxa"/>
-              <w:bottom w:w="60" w:type="dxa"/>
-              <w:left w:w="100" w:type="dxa"/>
-              <w:right w:w="100" w:type="dxa"/>
+              <w:top w:w="80" w:type="dxa"/>
+              <w:bottom w:w="80" w:type="dxa"/>
+              <w:left w:w="120" w:type="dxa"/>
+              <w:right w:w="120" w:type="dxa"/>
             </w:tcMar>
           </w:tcPr>
           <w:p>
@@ -2658,7 +2712,7 @@
             <w:r>
               <w:rPr>
                 <w:rFonts w:ascii="Times New Roman" w:hAnsi="Times New Roman"/>
-                <w:sz w:val="18"/>
+                <w:sz w:val="20"/>
               </w:rPr>
               <w:t>(None, 64)</w:t>
             </w:r>
@@ -2669,10 +2723,10 @@
             <w:tcW w:type="dxa" w:w="1440"/>
             <w:shd w:fill="F8FAFC"/>
             <w:tcMar>
-              <w:top w:w="60" w:type="dxa"/>
-              <w:bottom w:w="60" w:type="dxa"/>
-              <w:left w:w="100" w:type="dxa"/>
-              <w:right w:w="100" w:type="dxa"/>
+              <w:top w:w="80" w:type="dxa"/>
+              <w:bottom w:w="80" w:type="dxa"/>
+              <w:left w:w="120" w:type="dxa"/>
+              <w:right w:w="120" w:type="dxa"/>
             </w:tcMar>
           </w:tcPr>
           <w:p>
@@ -2682,7 +2736,7 @@
             <w:r>
               <w:rPr>
                 <w:rFonts w:ascii="Times New Roman" w:hAnsi="Times New Roman"/>
-                <w:sz w:val="18"/>
+                <w:sz w:val="20"/>
               </w:rPr>
               <w:t>16,448</w:t>
             </w:r>
@@ -2693,10 +2747,10 @@
             <w:tcW w:type="dxa" w:w="1440"/>
             <w:shd w:fill="F8FAFC"/>
             <w:tcMar>
-              <w:top w:w="60" w:type="dxa"/>
-              <w:bottom w:w="60" w:type="dxa"/>
-              <w:left w:w="100" w:type="dxa"/>
-              <w:right w:w="100" w:type="dxa"/>
+              <w:top w:w="80" w:type="dxa"/>
+              <w:bottom w:w="80" w:type="dxa"/>
+              <w:left w:w="120" w:type="dxa"/>
+              <w:right w:w="120" w:type="dxa"/>
             </w:tcMar>
           </w:tcPr>
           <w:p>
@@ -2706,7 +2760,7 @@
             <w:r>
               <w:rPr>
                 <w:rFonts w:ascii="Times New Roman" w:hAnsi="Times New Roman"/>
-                <w:sz w:val="18"/>
+                <w:sz w:val="20"/>
               </w:rPr>
               <w:t>ReLU</w:t>
             </w:r>
@@ -2717,10 +2771,10 @@
             <w:tcW w:type="dxa" w:w="3312"/>
             <w:shd w:fill="F8FAFC"/>
             <w:tcMar>
-              <w:top w:w="60" w:type="dxa"/>
-              <w:bottom w:w="60" w:type="dxa"/>
-              <w:left w:w="100" w:type="dxa"/>
-              <w:right w:w="100" w:type="dxa"/>
+              <w:top w:w="80" w:type="dxa"/>
+              <w:bottom w:w="80" w:type="dxa"/>
+              <w:left w:w="120" w:type="dxa"/>
+              <w:right w:w="120" w:type="dxa"/>
             </w:tcMar>
           </w:tcPr>
           <w:p>
@@ -2730,7 +2784,7 @@
             <w:r>
               <w:rPr>
                 <w:rFonts w:ascii="Times New Roman" w:hAnsi="Times New Roman"/>
-                <w:sz w:val="18"/>
+                <w:sz w:val="20"/>
               </w:rPr>
               <w:t>Fully connected representation layer</w:t>
             </w:r>
@@ -2743,10 +2797,10 @@
             <w:tcW w:type="dxa" w:w="2160"/>
             <w:shd w:fill="FFFFFF"/>
             <w:tcMar>
-              <w:top w:w="60" w:type="dxa"/>
-              <w:bottom w:w="60" w:type="dxa"/>
-              <w:left w:w="100" w:type="dxa"/>
-              <w:right w:w="100" w:type="dxa"/>
+              <w:top w:w="80" w:type="dxa"/>
+              <w:bottom w:w="80" w:type="dxa"/>
+              <w:left w:w="120" w:type="dxa"/>
+              <w:right w:w="120" w:type="dxa"/>
             </w:tcMar>
           </w:tcPr>
           <w:p>
@@ -2756,7 +2810,7 @@
             <w:r>
               <w:rPr>
                 <w:rFonts w:ascii="Times New Roman" w:hAnsi="Times New Roman"/>
-                <w:sz w:val="18"/>
+                <w:sz w:val="20"/>
               </w:rPr>
               <w:t>Dropout</w:t>
             </w:r>
@@ -2767,10 +2821,10 @@
             <w:tcW w:type="dxa" w:w="1728"/>
             <w:shd w:fill="FFFFFF"/>
             <w:tcMar>
-              <w:top w:w="60" w:type="dxa"/>
-              <w:bottom w:w="60" w:type="dxa"/>
-              <w:left w:w="100" w:type="dxa"/>
-              <w:right w:w="100" w:type="dxa"/>
+              <w:top w:w="80" w:type="dxa"/>
+              <w:bottom w:w="80" w:type="dxa"/>
+              <w:left w:w="120" w:type="dxa"/>
+              <w:right w:w="120" w:type="dxa"/>
             </w:tcMar>
           </w:tcPr>
           <w:p>
@@ -2780,7 +2834,7 @@
             <w:r>
               <w:rPr>
                 <w:rFonts w:ascii="Times New Roman" w:hAnsi="Times New Roman"/>
-                <w:sz w:val="18"/>
+                <w:sz w:val="20"/>
               </w:rPr>
               <w:t>(None, 64)</w:t>
             </w:r>
@@ -2791,10 +2845,10 @@
             <w:tcW w:type="dxa" w:w="1440"/>
             <w:shd w:fill="FFFFFF"/>
             <w:tcMar>
-              <w:top w:w="60" w:type="dxa"/>
-              <w:bottom w:w="60" w:type="dxa"/>
-              <w:left w:w="100" w:type="dxa"/>
-              <w:right w:w="100" w:type="dxa"/>
+              <w:top w:w="80" w:type="dxa"/>
+              <w:bottom w:w="80" w:type="dxa"/>
+              <w:left w:w="120" w:type="dxa"/>
+              <w:right w:w="120" w:type="dxa"/>
             </w:tcMar>
           </w:tcPr>
           <w:p>
@@ -2804,7 +2858,7 @@
             <w:r>
               <w:rPr>
                 <w:rFonts w:ascii="Times New Roman" w:hAnsi="Times New Roman"/>
-                <w:sz w:val="18"/>
+                <w:sz w:val="20"/>
               </w:rPr>
               <w:t>0</w:t>
             </w:r>
@@ -2815,10 +2869,10 @@
             <w:tcW w:type="dxa" w:w="1440"/>
             <w:shd w:fill="FFFFFF"/>
             <w:tcMar>
-              <w:top w:w="60" w:type="dxa"/>
-              <w:bottom w:w="60" w:type="dxa"/>
-              <w:left w:w="100" w:type="dxa"/>
-              <w:right w:w="100" w:type="dxa"/>
+              <w:top w:w="80" w:type="dxa"/>
+              <w:bottom w:w="80" w:type="dxa"/>
+              <w:left w:w="120" w:type="dxa"/>
+              <w:right w:w="120" w:type="dxa"/>
             </w:tcMar>
           </w:tcPr>
           <w:p>
@@ -2828,7 +2882,7 @@
             <w:r>
               <w:rPr>
                 <w:rFonts w:ascii="Times New Roman" w:hAnsi="Times New Roman"/>
-                <w:sz w:val="18"/>
+                <w:sz w:val="20"/>
               </w:rPr>
               <w:t>-</w:t>
             </w:r>
@@ -2839,10 +2893,10 @@
             <w:tcW w:type="dxa" w:w="3312"/>
             <w:shd w:fill="FFFFFF"/>
             <w:tcMar>
-              <w:top w:w="60" w:type="dxa"/>
-              <w:bottom w:w="60" w:type="dxa"/>
-              <w:left w:w="100" w:type="dxa"/>
-              <w:right w:w="100" w:type="dxa"/>
+              <w:top w:w="80" w:type="dxa"/>
+              <w:bottom w:w="80" w:type="dxa"/>
+              <w:left w:w="120" w:type="dxa"/>
+              <w:right w:w="120" w:type="dxa"/>
             </w:tcMar>
           </w:tcPr>
           <w:p>
@@ -2852,7 +2906,7 @@
             <w:r>
               <w:rPr>
                 <w:rFonts w:ascii="Times New Roman" w:hAnsi="Times New Roman"/>
-                <w:sz w:val="18"/>
+                <w:sz w:val="20"/>
               </w:rPr>
               <w:t>Dropout Rate = 0.2</w:t>
             </w:r>
@@ -2865,10 +2919,10 @@
             <w:tcW w:type="dxa" w:w="2160"/>
             <w:shd w:fill="F8FAFC"/>
             <w:tcMar>
-              <w:top w:w="60" w:type="dxa"/>
-              <w:bottom w:w="60" w:type="dxa"/>
-              <w:left w:w="100" w:type="dxa"/>
-              <w:right w:w="100" w:type="dxa"/>
+              <w:top w:w="80" w:type="dxa"/>
+              <w:bottom w:w="80" w:type="dxa"/>
+              <w:left w:w="120" w:type="dxa"/>
+              <w:right w:w="120" w:type="dxa"/>
             </w:tcMar>
           </w:tcPr>
           <w:p>
@@ -2878,7 +2932,7 @@
             <w:r>
               <w:rPr>
                 <w:rFonts w:ascii="Times New Roman" w:hAnsi="Times New Roman"/>
-                <w:sz w:val="18"/>
+                <w:sz w:val="20"/>
               </w:rPr>
               <w:t>Dense (Output)</w:t>
             </w:r>
@@ -2889,10 +2943,10 @@
             <w:tcW w:type="dxa" w:w="1728"/>
             <w:shd w:fill="F8FAFC"/>
             <w:tcMar>
-              <w:top w:w="60" w:type="dxa"/>
-              <w:bottom w:w="60" w:type="dxa"/>
-              <w:left w:w="100" w:type="dxa"/>
-              <w:right w:w="100" w:type="dxa"/>
+              <w:top w:w="80" w:type="dxa"/>
+              <w:bottom w:w="80" w:type="dxa"/>
+              <w:left w:w="120" w:type="dxa"/>
+              <w:right w:w="120" w:type="dxa"/>
             </w:tcMar>
           </w:tcPr>
           <w:p>
@@ -2902,7 +2956,7 @@
             <w:r>
               <w:rPr>
                 <w:rFonts w:ascii="Times New Roman" w:hAnsi="Times New Roman"/>
-                <w:sz w:val="18"/>
+                <w:sz w:val="20"/>
               </w:rPr>
               <w:t>(None, 5)</w:t>
             </w:r>
@@ -2913,10 +2967,10 @@
             <w:tcW w:type="dxa" w:w="1440"/>
             <w:shd w:fill="F8FAFC"/>
             <w:tcMar>
-              <w:top w:w="60" w:type="dxa"/>
-              <w:bottom w:w="60" w:type="dxa"/>
-              <w:left w:w="100" w:type="dxa"/>
-              <w:right w:w="100" w:type="dxa"/>
+              <w:top w:w="80" w:type="dxa"/>
+              <w:bottom w:w="80" w:type="dxa"/>
+              <w:left w:w="120" w:type="dxa"/>
+              <w:right w:w="120" w:type="dxa"/>
             </w:tcMar>
           </w:tcPr>
           <w:p>
@@ -2926,7 +2980,7 @@
             <w:r>
               <w:rPr>
                 <w:rFonts w:ascii="Times New Roman" w:hAnsi="Times New Roman"/>
-                <w:sz w:val="18"/>
+                <w:sz w:val="20"/>
               </w:rPr>
               <w:t>325</w:t>
             </w:r>
@@ -2937,10 +2991,10 @@
             <w:tcW w:type="dxa" w:w="1440"/>
             <w:shd w:fill="F8FAFC"/>
             <w:tcMar>
-              <w:top w:w="60" w:type="dxa"/>
-              <w:bottom w:w="60" w:type="dxa"/>
-              <w:left w:w="100" w:type="dxa"/>
-              <w:right w:w="100" w:type="dxa"/>
+              <w:top w:w="80" w:type="dxa"/>
+              <w:bottom w:w="80" w:type="dxa"/>
+              <w:left w:w="120" w:type="dxa"/>
+              <w:right w:w="120" w:type="dxa"/>
             </w:tcMar>
           </w:tcPr>
           <w:p>
@@ -2950,7 +3004,7 @@
             <w:r>
               <w:rPr>
                 <w:rFonts w:ascii="Times New Roman" w:hAnsi="Times New Roman"/>
-                <w:sz w:val="18"/>
+                <w:sz w:val="20"/>
               </w:rPr>
               <w:t>Softmax</w:t>
             </w:r>
@@ -2961,10 +3015,10 @@
             <w:tcW w:type="dxa" w:w="3312"/>
             <w:shd w:fill="F8FAFC"/>
             <w:tcMar>
-              <w:top w:w="60" w:type="dxa"/>
-              <w:bottom w:w="60" w:type="dxa"/>
-              <w:left w:w="100" w:type="dxa"/>
-              <w:right w:w="100" w:type="dxa"/>
+              <w:top w:w="80" w:type="dxa"/>
+              <w:bottom w:w="80" w:type="dxa"/>
+              <w:left w:w="120" w:type="dxa"/>
+              <w:right w:w="120" w:type="dxa"/>
             </w:tcMar>
           </w:tcPr>
           <w:p>
@@ -2974,7 +3028,7 @@
             <w:r>
               <w:rPr>
                 <w:rFonts w:ascii="Times New Roman" w:hAnsi="Times New Roman"/>
-                <w:sz w:val="18"/>
+                <w:sz w:val="20"/>
               </w:rPr>
               <w:t>Multi-class probabilities (5 attack classes)</w:t>
             </w:r>
@@ -2996,8 +3050,8 @@
         <w:rPr>
           <w:rFonts w:ascii="Arial" w:hAnsi="Arial"/>
           <w:b/>
-          <w:color w:val="0F172A"/>
-          <w:sz w:val="23"/>
+          <w:color w:val="1E293B"/>
+          <w:sz w:val="25"/>
         </w:rPr>
         <w:t>APPENDIX C: Complete CICFlowMeter to NSL-KDD Feature Mapping</w:t>
       </w:r>
@@ -3008,6 +3062,14 @@
         <w:jc w:val="center"/>
         <w:tblLayout w:type="fixed"/>
         <w:tblLook w:firstColumn="1" w:firstRow="1" w:lastColumn="0" w:lastRow="0" w:noHBand="0" w:noVBand="1" w:val="04A0"/>
+        <w:tblBorders>
+          <w:top w:val="single" w:sz="4" w:space="0" w:color="CBD5E1"/>
+          <w:bottom w:val="single" w:sz="4" w:space="0" w:color="CBD5E1"/>
+          <w:left w:val="single" w:sz="4" w:space="0" w:color="CBD5E1"/>
+          <w:right w:val="single" w:sz="4" w:space="0" w:color="CBD5E1"/>
+          <w:insideH w:val="single" w:sz="4" w:space="0" w:color="CBD5E1"/>
+          <w:insideV w:val="single" w:sz="4" w:space="0" w:color="CBD5E1"/>
+        </w:tblBorders>
       </w:tblPr>
       <w:tblGrid>
         <w:gridCol w:w="1872"/>
@@ -3022,10 +3084,10 @@
             <w:tcW w:type="dxa" w:w="720"/>
             <w:shd w:fill="00529B"/>
             <w:tcMar>
-              <w:top w:w="100" w:type="dxa"/>
-              <w:bottom w:w="100" w:type="dxa"/>
-              <w:left w:w="120" w:type="dxa"/>
-              <w:right w:w="120" w:type="dxa"/>
+              <w:top w:w="120" w:type="dxa"/>
+              <w:bottom w:w="120" w:type="dxa"/>
+              <w:left w:w="140" w:type="dxa"/>
+              <w:right w:w="140" w:type="dxa"/>
             </w:tcMar>
           </w:tcPr>
           <w:p>
@@ -3037,7 +3099,7 @@
                 <w:rFonts w:ascii="Arial" w:hAnsi="Arial"/>
                 <w:b/>
                 <w:color w:val="FFFFFF"/>
-                <w:sz w:val="18"/>
+                <w:sz w:val="20"/>
               </w:rPr>
               <w:t>Idx</w:t>
             </w:r>
@@ -3048,10 +3110,10 @@
             <w:tcW w:type="dxa" w:w="2592"/>
             <w:shd w:fill="00529B"/>
             <w:tcMar>
-              <w:top w:w="100" w:type="dxa"/>
-              <w:bottom w:w="100" w:type="dxa"/>
-              <w:left w:w="120" w:type="dxa"/>
-              <w:right w:w="120" w:type="dxa"/>
+              <w:top w:w="120" w:type="dxa"/>
+              <w:bottom w:w="120" w:type="dxa"/>
+              <w:left w:w="140" w:type="dxa"/>
+              <w:right w:w="140" w:type="dxa"/>
             </w:tcMar>
           </w:tcPr>
           <w:p>
@@ -3063,7 +3125,7 @@
                 <w:rFonts w:ascii="Arial" w:hAnsi="Arial"/>
                 <w:b/>
                 <w:color w:val="FFFFFF"/>
-                <w:sz w:val="18"/>
+                <w:sz w:val="20"/>
               </w:rPr>
               <w:t>NSL-KDD Feature</w:t>
             </w:r>
@@ -3074,10 +3136,10 @@
             <w:tcW w:type="dxa" w:w="1872"/>
             <w:shd w:fill="00529B"/>
             <w:tcMar>
-              <w:top w:w="100" w:type="dxa"/>
-              <w:bottom w:w="100" w:type="dxa"/>
-              <w:left w:w="120" w:type="dxa"/>
-              <w:right w:w="120" w:type="dxa"/>
+              <w:top w:w="120" w:type="dxa"/>
+              <w:bottom w:w="120" w:type="dxa"/>
+              <w:left w:w="140" w:type="dxa"/>
+              <w:right w:w="140" w:type="dxa"/>
             </w:tcMar>
           </w:tcPr>
           <w:p>
@@ -3089,7 +3151,7 @@
                 <w:rFonts w:ascii="Arial" w:hAnsi="Arial"/>
                 <w:b/>
                 <w:color w:val="FFFFFF"/>
-                <w:sz w:val="18"/>
+                <w:sz w:val="20"/>
               </w:rPr>
               <w:t>BWOA Status</w:t>
             </w:r>
@@ -3100,10 +3162,10 @@
             <w:tcW w:type="dxa" w:w="2592"/>
             <w:shd w:fill="00529B"/>
             <w:tcMar>
-              <w:top w:w="100" w:type="dxa"/>
-              <w:bottom w:w="100" w:type="dxa"/>
-              <w:left w:w="120" w:type="dxa"/>
-              <w:right w:w="120" w:type="dxa"/>
+              <w:top w:w="120" w:type="dxa"/>
+              <w:bottom w:w="120" w:type="dxa"/>
+              <w:left w:w="140" w:type="dxa"/>
+              <w:right w:w="140" w:type="dxa"/>
             </w:tcMar>
           </w:tcPr>
           <w:p>
@@ -3115,7 +3177,7 @@
                 <w:rFonts w:ascii="Arial" w:hAnsi="Arial"/>
                 <w:b/>
                 <w:color w:val="FFFFFF"/>
-                <w:sz w:val="18"/>
+                <w:sz w:val="20"/>
               </w:rPr>
               <w:t>CICFlowMeter Equivalent</w:t>
             </w:r>
@@ -3126,10 +3188,10 @@
             <w:tcW w:type="dxa" w:w="2592"/>
             <w:shd w:fill="00529B"/>
             <w:tcMar>
-              <w:top w:w="100" w:type="dxa"/>
-              <w:bottom w:w="100" w:type="dxa"/>
-              <w:left w:w="120" w:type="dxa"/>
-              <w:right w:w="120" w:type="dxa"/>
+              <w:top w:w="120" w:type="dxa"/>
+              <w:bottom w:w="120" w:type="dxa"/>
+              <w:left w:w="140" w:type="dxa"/>
+              <w:right w:w="140" w:type="dxa"/>
             </w:tcMar>
           </w:tcPr>
           <w:p>
@@ -3141,7 +3203,7 @@
                 <w:rFonts w:ascii="Arial" w:hAnsi="Arial"/>
                 <w:b/>
                 <w:color w:val="FFFFFF"/>
-                <w:sz w:val="18"/>
+                <w:sz w:val="20"/>
               </w:rPr>
               <w:t>Description</w:t>
             </w:r>
@@ -3154,10 +3216,10 @@
             <w:tcW w:type="dxa" w:w="720"/>
             <w:shd w:fill="FFFFFF"/>
             <w:tcMar>
-              <w:top w:w="60" w:type="dxa"/>
-              <w:bottom w:w="60" w:type="dxa"/>
-              <w:left w:w="100" w:type="dxa"/>
-              <w:right w:w="100" w:type="dxa"/>
+              <w:top w:w="80" w:type="dxa"/>
+              <w:bottom w:w="80" w:type="dxa"/>
+              <w:left w:w="120" w:type="dxa"/>
+              <w:right w:w="120" w:type="dxa"/>
             </w:tcMar>
           </w:tcPr>
           <w:p>
@@ -3167,7 +3229,7 @@
             <w:r>
               <w:rPr>
                 <w:rFonts w:ascii="Times New Roman" w:hAnsi="Times New Roman"/>
-                <w:sz w:val="18"/>
+                <w:sz w:val="20"/>
               </w:rPr>
               <w:t>1</w:t>
             </w:r>
@@ -3178,10 +3240,10 @@
             <w:tcW w:type="dxa" w:w="2592"/>
             <w:shd w:fill="FFFFFF"/>
             <w:tcMar>
-              <w:top w:w="60" w:type="dxa"/>
-              <w:bottom w:w="60" w:type="dxa"/>
-              <w:left w:w="100" w:type="dxa"/>
-              <w:right w:w="100" w:type="dxa"/>
+              <w:top w:w="80" w:type="dxa"/>
+              <w:bottom w:w="80" w:type="dxa"/>
+              <w:left w:w="120" w:type="dxa"/>
+              <w:right w:w="120" w:type="dxa"/>
             </w:tcMar>
           </w:tcPr>
           <w:p>
@@ -3191,7 +3253,7 @@
             <w:r>
               <w:rPr>
                 <w:rFonts w:ascii="Times New Roman" w:hAnsi="Times New Roman"/>
-                <w:sz w:val="18"/>
+                <w:sz w:val="20"/>
               </w:rPr>
               <w:t>duration</w:t>
             </w:r>
@@ -3202,10 +3264,10 @@
             <w:tcW w:type="dxa" w:w="1872"/>
             <w:shd w:fill="FFFFFF"/>
             <w:tcMar>
-              <w:top w:w="60" w:type="dxa"/>
-              <w:bottom w:w="60" w:type="dxa"/>
-              <w:left w:w="100" w:type="dxa"/>
-              <w:right w:w="100" w:type="dxa"/>
+              <w:top w:w="80" w:type="dxa"/>
+              <w:bottom w:w="80" w:type="dxa"/>
+              <w:left w:w="120" w:type="dxa"/>
+              <w:right w:w="120" w:type="dxa"/>
             </w:tcMar>
           </w:tcPr>
           <w:p>
@@ -3215,7 +3277,7 @@
             <w:r>
               <w:rPr>
                 <w:rFonts w:ascii="Times New Roman" w:hAnsi="Times New Roman"/>
-                <w:sz w:val="18"/>
+                <w:sz w:val="20"/>
               </w:rPr>
               <w:t>Pruned</w:t>
             </w:r>
@@ -3226,10 +3288,10 @@
             <w:tcW w:type="dxa" w:w="2592"/>
             <w:shd w:fill="FFFFFF"/>
             <w:tcMar>
-              <w:top w:w="60" w:type="dxa"/>
-              <w:bottom w:w="60" w:type="dxa"/>
-              <w:left w:w="100" w:type="dxa"/>
-              <w:right w:w="100" w:type="dxa"/>
+              <w:top w:w="80" w:type="dxa"/>
+              <w:bottom w:w="80" w:type="dxa"/>
+              <w:left w:w="120" w:type="dxa"/>
+              <w:right w:w="120" w:type="dxa"/>
             </w:tcMar>
           </w:tcPr>
           <w:p>
@@ -3239,7 +3301,7 @@
             <w:r>
               <w:rPr>
                 <w:rFonts w:ascii="Times New Roman" w:hAnsi="Times New Roman"/>
-                <w:sz w:val="18"/>
+                <w:sz w:val="20"/>
               </w:rPr>
               <w:t>Flow Duration</w:t>
             </w:r>
@@ -3250,10 +3312,10 @@
             <w:tcW w:type="dxa" w:w="2592"/>
             <w:shd w:fill="FFFFFF"/>
             <w:tcMar>
-              <w:top w:w="60" w:type="dxa"/>
-              <w:bottom w:w="60" w:type="dxa"/>
-              <w:left w:w="100" w:type="dxa"/>
-              <w:right w:w="100" w:type="dxa"/>
+              <w:top w:w="80" w:type="dxa"/>
+              <w:bottom w:w="80" w:type="dxa"/>
+              <w:left w:w="120" w:type="dxa"/>
+              <w:right w:w="120" w:type="dxa"/>
             </w:tcMar>
           </w:tcPr>
           <w:p>
@@ -3263,7 +3325,7 @@
             <w:r>
               <w:rPr>
                 <w:rFonts w:ascii="Times New Roman" w:hAnsi="Times New Roman"/>
-                <w:sz w:val="18"/>
+                <w:sz w:val="20"/>
               </w:rPr>
               <w:t>Connection duration in seconds</w:t>
             </w:r>
@@ -3276,10 +3338,10 @@
             <w:tcW w:type="dxa" w:w="720"/>
             <w:shd w:fill="F8FAFC"/>
             <w:tcMar>
-              <w:top w:w="60" w:type="dxa"/>
-              <w:bottom w:w="60" w:type="dxa"/>
-              <w:left w:w="100" w:type="dxa"/>
-              <w:right w:w="100" w:type="dxa"/>
+              <w:top w:w="80" w:type="dxa"/>
+              <w:bottom w:w="80" w:type="dxa"/>
+              <w:left w:w="120" w:type="dxa"/>
+              <w:right w:w="120" w:type="dxa"/>
             </w:tcMar>
           </w:tcPr>
           <w:p>
@@ -3289,7 +3351,7 @@
             <w:r>
               <w:rPr>
                 <w:rFonts w:ascii="Times New Roman" w:hAnsi="Times New Roman"/>
-                <w:sz w:val="18"/>
+                <w:sz w:val="20"/>
               </w:rPr>
               <w:t>2</w:t>
             </w:r>
@@ -3300,10 +3362,10 @@
             <w:tcW w:type="dxa" w:w="2592"/>
             <w:shd w:fill="F8FAFC"/>
             <w:tcMar>
-              <w:top w:w="60" w:type="dxa"/>
-              <w:bottom w:w="60" w:type="dxa"/>
-              <w:left w:w="100" w:type="dxa"/>
-              <w:right w:w="100" w:type="dxa"/>
+              <w:top w:w="80" w:type="dxa"/>
+              <w:bottom w:w="80" w:type="dxa"/>
+              <w:left w:w="120" w:type="dxa"/>
+              <w:right w:w="120" w:type="dxa"/>
             </w:tcMar>
           </w:tcPr>
           <w:p>
@@ -3313,7 +3375,7 @@
             <w:r>
               <w:rPr>
                 <w:rFonts w:ascii="Times New Roman" w:hAnsi="Times New Roman"/>
-                <w:sz w:val="18"/>
+                <w:sz w:val="20"/>
               </w:rPr>
               <w:t>protocol_type</w:t>
             </w:r>
@@ -3324,10 +3386,10 @@
             <w:tcW w:type="dxa" w:w="1872"/>
             <w:shd w:fill="F8FAFC"/>
             <w:tcMar>
-              <w:top w:w="60" w:type="dxa"/>
-              <w:bottom w:w="60" w:type="dxa"/>
-              <w:left w:w="100" w:type="dxa"/>
-              <w:right w:w="100" w:type="dxa"/>
+              <w:top w:w="80" w:type="dxa"/>
+              <w:bottom w:w="80" w:type="dxa"/>
+              <w:left w:w="120" w:type="dxa"/>
+              <w:right w:w="120" w:type="dxa"/>
             </w:tcMar>
           </w:tcPr>
           <w:p>
@@ -3337,7 +3399,7 @@
             <w:r>
               <w:rPr>
                 <w:rFonts w:ascii="Times New Roman" w:hAnsi="Times New Roman"/>
-                <w:sz w:val="18"/>
+                <w:sz w:val="20"/>
               </w:rPr>
               <w:t>SELECTED (8)</w:t>
             </w:r>
@@ -3348,10 +3410,10 @@
             <w:tcW w:type="dxa" w:w="2592"/>
             <w:shd w:fill="F8FAFC"/>
             <w:tcMar>
-              <w:top w:w="60" w:type="dxa"/>
-              <w:bottom w:w="60" w:type="dxa"/>
-              <w:left w:w="100" w:type="dxa"/>
-              <w:right w:w="100" w:type="dxa"/>
+              <w:top w:w="80" w:type="dxa"/>
+              <w:bottom w:w="80" w:type="dxa"/>
+              <w:left w:w="120" w:type="dxa"/>
+              <w:right w:w="120" w:type="dxa"/>
             </w:tcMar>
           </w:tcPr>
           <w:p>
@@ -3361,7 +3423,7 @@
             <w:r>
               <w:rPr>
                 <w:rFonts w:ascii="Times New Roman" w:hAnsi="Times New Roman"/>
-                <w:sz w:val="18"/>
+                <w:sz w:val="20"/>
               </w:rPr>
               <w:t>Protocol</w:t>
             </w:r>
@@ -3372,10 +3434,10 @@
             <w:tcW w:type="dxa" w:w="2592"/>
             <w:shd w:fill="F8FAFC"/>
             <w:tcMar>
-              <w:top w:w="60" w:type="dxa"/>
-              <w:bottom w:w="60" w:type="dxa"/>
-              <w:left w:w="100" w:type="dxa"/>
-              <w:right w:w="100" w:type="dxa"/>
+              <w:top w:w="80" w:type="dxa"/>
+              <w:bottom w:w="80" w:type="dxa"/>
+              <w:left w:w="120" w:type="dxa"/>
+              <w:right w:w="120" w:type="dxa"/>
             </w:tcMar>
           </w:tcPr>
           <w:p>
@@ -3385,7 +3447,7 @@
             <w:r>
               <w:rPr>
                 <w:rFonts w:ascii="Times New Roman" w:hAnsi="Times New Roman"/>
-                <w:sz w:val="18"/>
+                <w:sz w:val="20"/>
               </w:rPr>
               <w:t>Network layer protocol (TCP/UDP/ICMP)</w:t>
             </w:r>
@@ -3398,10 +3460,10 @@
             <w:tcW w:type="dxa" w:w="720"/>
             <w:shd w:fill="FFFFFF"/>
             <w:tcMar>
-              <w:top w:w="60" w:type="dxa"/>
-              <w:bottom w:w="60" w:type="dxa"/>
-              <w:left w:w="100" w:type="dxa"/>
-              <w:right w:w="100" w:type="dxa"/>
+              <w:top w:w="80" w:type="dxa"/>
+              <w:bottom w:w="80" w:type="dxa"/>
+              <w:left w:w="120" w:type="dxa"/>
+              <w:right w:w="120" w:type="dxa"/>
             </w:tcMar>
           </w:tcPr>
           <w:p>
@@ -3411,7 +3473,7 @@
             <w:r>
               <w:rPr>
                 <w:rFonts w:ascii="Times New Roman" w:hAnsi="Times New Roman"/>
-                <w:sz w:val="18"/>
+                <w:sz w:val="20"/>
               </w:rPr>
               <w:t>3</w:t>
             </w:r>
@@ -3422,10 +3484,10 @@
             <w:tcW w:type="dxa" w:w="2592"/>
             <w:shd w:fill="FFFFFF"/>
             <w:tcMar>
-              <w:top w:w="60" w:type="dxa"/>
-              <w:bottom w:w="60" w:type="dxa"/>
-              <w:left w:w="100" w:type="dxa"/>
-              <w:right w:w="100" w:type="dxa"/>
+              <w:top w:w="80" w:type="dxa"/>
+              <w:bottom w:w="80" w:type="dxa"/>
+              <w:left w:w="120" w:type="dxa"/>
+              <w:right w:w="120" w:type="dxa"/>
             </w:tcMar>
           </w:tcPr>
           <w:p>
@@ -3435,7 +3497,7 @@
             <w:r>
               <w:rPr>
                 <w:rFonts w:ascii="Times New Roman" w:hAnsi="Times New Roman"/>
-                <w:sz w:val="18"/>
+                <w:sz w:val="20"/>
               </w:rPr>
               <w:t>service</w:t>
             </w:r>
@@ -3446,10 +3508,10 @@
             <w:tcW w:type="dxa" w:w="1872"/>
             <w:shd w:fill="FFFFFF"/>
             <w:tcMar>
-              <w:top w:w="60" w:type="dxa"/>
-              <w:bottom w:w="60" w:type="dxa"/>
-              <w:left w:w="100" w:type="dxa"/>
-              <w:right w:w="100" w:type="dxa"/>
+              <w:top w:w="80" w:type="dxa"/>
+              <w:bottom w:w="80" w:type="dxa"/>
+              <w:left w:w="120" w:type="dxa"/>
+              <w:right w:w="120" w:type="dxa"/>
             </w:tcMar>
           </w:tcPr>
           <w:p>
@@ -3459,7 +3521,7 @@
             <w:r>
               <w:rPr>
                 <w:rFonts w:ascii="Times New Roman" w:hAnsi="Times New Roman"/>
-                <w:sz w:val="18"/>
+                <w:sz w:val="20"/>
               </w:rPr>
               <w:t>SELECTED (2)</w:t>
             </w:r>
@@ -3470,10 +3532,10 @@
             <w:tcW w:type="dxa" w:w="2592"/>
             <w:shd w:fill="FFFFFF"/>
             <w:tcMar>
-              <w:top w:w="60" w:type="dxa"/>
-              <w:bottom w:w="60" w:type="dxa"/>
-              <w:left w:w="100" w:type="dxa"/>
-              <w:right w:w="100" w:type="dxa"/>
+              <w:top w:w="80" w:type="dxa"/>
+              <w:bottom w:w="80" w:type="dxa"/>
+              <w:left w:w="120" w:type="dxa"/>
+              <w:right w:w="120" w:type="dxa"/>
             </w:tcMar>
           </w:tcPr>
           <w:p>
@@ -3483,7 +3545,7 @@
             <w:r>
               <w:rPr>
                 <w:rFonts w:ascii="Times New Roman" w:hAnsi="Times New Roman"/>
-                <w:sz w:val="18"/>
+                <w:sz w:val="20"/>
               </w:rPr>
               <w:t>Dst Port / App Protocol</w:t>
             </w:r>
@@ -3494,10 +3556,10 @@
             <w:tcW w:type="dxa" w:w="2592"/>
             <w:shd w:fill="FFFFFF"/>
             <w:tcMar>
-              <w:top w:w="60" w:type="dxa"/>
-              <w:bottom w:w="60" w:type="dxa"/>
-              <w:left w:w="100" w:type="dxa"/>
-              <w:right w:w="100" w:type="dxa"/>
+              <w:top w:w="80" w:type="dxa"/>
+              <w:bottom w:w="80" w:type="dxa"/>
+              <w:left w:w="120" w:type="dxa"/>
+              <w:right w:w="120" w:type="dxa"/>
             </w:tcMar>
           </w:tcPr>
           <w:p>
@@ -3507,7 +3569,7 @@
             <w:r>
               <w:rPr>
                 <w:rFonts w:ascii="Times New Roman" w:hAnsi="Times New Roman"/>
-                <w:sz w:val="18"/>
+                <w:sz w:val="20"/>
               </w:rPr>
               <w:t>Destination service (HTTP, Modbus, Private)</w:t>
             </w:r>
@@ -3520,10 +3582,10 @@
             <w:tcW w:type="dxa" w:w="720"/>
             <w:shd w:fill="F8FAFC"/>
             <w:tcMar>
-              <w:top w:w="60" w:type="dxa"/>
-              <w:bottom w:w="60" w:type="dxa"/>
-              <w:left w:w="100" w:type="dxa"/>
-              <w:right w:w="100" w:type="dxa"/>
+              <w:top w:w="80" w:type="dxa"/>
+              <w:bottom w:w="80" w:type="dxa"/>
+              <w:left w:w="120" w:type="dxa"/>
+              <w:right w:w="120" w:type="dxa"/>
             </w:tcMar>
           </w:tcPr>
           <w:p>
@@ -3533,7 +3595,7 @@
             <w:r>
               <w:rPr>
                 <w:rFonts w:ascii="Times New Roman" w:hAnsi="Times New Roman"/>
-                <w:sz w:val="18"/>
+                <w:sz w:val="20"/>
               </w:rPr>
               <w:t>4</w:t>
             </w:r>
@@ -3544,10 +3606,10 @@
             <w:tcW w:type="dxa" w:w="2592"/>
             <w:shd w:fill="F8FAFC"/>
             <w:tcMar>
-              <w:top w:w="60" w:type="dxa"/>
-              <w:bottom w:w="60" w:type="dxa"/>
-              <w:left w:w="100" w:type="dxa"/>
-              <w:right w:w="100" w:type="dxa"/>
+              <w:top w:w="80" w:type="dxa"/>
+              <w:bottom w:w="80" w:type="dxa"/>
+              <w:left w:w="120" w:type="dxa"/>
+              <w:right w:w="120" w:type="dxa"/>
             </w:tcMar>
           </w:tcPr>
           <w:p>
@@ -3557,7 +3619,7 @@
             <w:r>
               <w:rPr>
                 <w:rFonts w:ascii="Times New Roman" w:hAnsi="Times New Roman"/>
-                <w:sz w:val="18"/>
+                <w:sz w:val="20"/>
               </w:rPr>
               <w:t>flag</w:t>
             </w:r>
@@ -3568,10 +3630,10 @@
             <w:tcW w:type="dxa" w:w="1872"/>
             <w:shd w:fill="F8FAFC"/>
             <w:tcMar>
-              <w:top w:w="60" w:type="dxa"/>
-              <w:bottom w:w="60" w:type="dxa"/>
-              <w:left w:w="100" w:type="dxa"/>
-              <w:right w:w="100" w:type="dxa"/>
+              <w:top w:w="80" w:type="dxa"/>
+              <w:bottom w:w="80" w:type="dxa"/>
+              <w:left w:w="120" w:type="dxa"/>
+              <w:right w:w="120" w:type="dxa"/>
             </w:tcMar>
           </w:tcPr>
           <w:p>
@@ -3581,7 +3643,7 @@
             <w:r>
               <w:rPr>
                 <w:rFonts w:ascii="Times New Roman" w:hAnsi="Times New Roman"/>
-                <w:sz w:val="18"/>
+                <w:sz w:val="20"/>
               </w:rPr>
               <w:t>SELECTED (3)</w:t>
             </w:r>
@@ -3592,10 +3654,10 @@
             <w:tcW w:type="dxa" w:w="2592"/>
             <w:shd w:fill="F8FAFC"/>
             <w:tcMar>
-              <w:top w:w="60" w:type="dxa"/>
-              <w:bottom w:w="60" w:type="dxa"/>
-              <w:left w:w="100" w:type="dxa"/>
-              <w:right w:w="100" w:type="dxa"/>
+              <w:top w:w="80" w:type="dxa"/>
+              <w:bottom w:w="80" w:type="dxa"/>
+              <w:left w:w="120" w:type="dxa"/>
+              <w:right w:w="120" w:type="dxa"/>
             </w:tcMar>
           </w:tcPr>
           <w:p>
@@ -3605,7 +3667,7 @@
             <w:r>
               <w:rPr>
                 <w:rFonts w:ascii="Times New Roman" w:hAnsi="Times New Roman"/>
-                <w:sz w:val="18"/>
+                <w:sz w:val="20"/>
               </w:rPr>
               <w:t>TCP Flags Count</w:t>
             </w:r>
@@ -3616,10 +3678,10 @@
             <w:tcW w:type="dxa" w:w="2592"/>
             <w:shd w:fill="F8FAFC"/>
             <w:tcMar>
-              <w:top w:w="60" w:type="dxa"/>
-              <w:bottom w:w="60" w:type="dxa"/>
-              <w:left w:w="100" w:type="dxa"/>
-              <w:right w:w="100" w:type="dxa"/>
+              <w:top w:w="80" w:type="dxa"/>
+              <w:bottom w:w="80" w:type="dxa"/>
+              <w:left w:w="120" w:type="dxa"/>
+              <w:right w:w="120" w:type="dxa"/>
             </w:tcMar>
           </w:tcPr>
           <w:p>
@@ -3629,7 +3691,7 @@
             <w:r>
               <w:rPr>
                 <w:rFonts w:ascii="Times New Roman" w:hAnsi="Times New Roman"/>
-                <w:sz w:val="18"/>
+                <w:sz w:val="20"/>
               </w:rPr>
               <w:t>Connection completion status (SF, S0, REJ)</w:t>
             </w:r>
@@ -3642,10 +3704,10 @@
             <w:tcW w:type="dxa" w:w="720"/>
             <w:shd w:fill="FFFFFF"/>
             <w:tcMar>
-              <w:top w:w="60" w:type="dxa"/>
-              <w:bottom w:w="60" w:type="dxa"/>
-              <w:left w:w="100" w:type="dxa"/>
-              <w:right w:w="100" w:type="dxa"/>
+              <w:top w:w="80" w:type="dxa"/>
+              <w:bottom w:w="80" w:type="dxa"/>
+              <w:left w:w="120" w:type="dxa"/>
+              <w:right w:w="120" w:type="dxa"/>
             </w:tcMar>
           </w:tcPr>
           <w:p>
@@ -3655,7 +3717,7 @@
             <w:r>
               <w:rPr>
                 <w:rFonts w:ascii="Times New Roman" w:hAnsi="Times New Roman"/>
-                <w:sz w:val="18"/>
+                <w:sz w:val="20"/>
               </w:rPr>
               <w:t>5</w:t>
             </w:r>
@@ -3666,10 +3728,10 @@
             <w:tcW w:type="dxa" w:w="2592"/>
             <w:shd w:fill="FFFFFF"/>
             <w:tcMar>
-              <w:top w:w="60" w:type="dxa"/>
-              <w:bottom w:w="60" w:type="dxa"/>
-              <w:left w:w="100" w:type="dxa"/>
-              <w:right w:w="100" w:type="dxa"/>
+              <w:top w:w="80" w:type="dxa"/>
+              <w:bottom w:w="80" w:type="dxa"/>
+              <w:left w:w="120" w:type="dxa"/>
+              <w:right w:w="120" w:type="dxa"/>
             </w:tcMar>
           </w:tcPr>
           <w:p>
@@ -3679,7 +3741,7 @@
             <w:r>
               <w:rPr>
                 <w:rFonts w:ascii="Times New Roman" w:hAnsi="Times New Roman"/>
-                <w:sz w:val="18"/>
+                <w:sz w:val="20"/>
               </w:rPr>
               <w:t>src_bytes</w:t>
             </w:r>
@@ -3690,10 +3752,10 @@
             <w:tcW w:type="dxa" w:w="1872"/>
             <w:shd w:fill="FFFFFF"/>
             <w:tcMar>
-              <w:top w:w="60" w:type="dxa"/>
-              <w:bottom w:w="60" w:type="dxa"/>
-              <w:left w:w="100" w:type="dxa"/>
-              <w:right w:w="100" w:type="dxa"/>
+              <w:top w:w="80" w:type="dxa"/>
+              <w:bottom w:w="80" w:type="dxa"/>
+              <w:left w:w="120" w:type="dxa"/>
+              <w:right w:w="120" w:type="dxa"/>
             </w:tcMar>
           </w:tcPr>
           <w:p>
@@ -3703,7 +3765,7 @@
             <w:r>
               <w:rPr>
                 <w:rFonts w:ascii="Times New Roman" w:hAnsi="Times New Roman"/>
-                <w:sz w:val="18"/>
+                <w:sz w:val="20"/>
               </w:rPr>
               <w:t>SELECTED (1)</w:t>
             </w:r>
@@ -3714,10 +3776,10 @@
             <w:tcW w:type="dxa" w:w="2592"/>
             <w:shd w:fill="FFFFFF"/>
             <w:tcMar>
-              <w:top w:w="60" w:type="dxa"/>
-              <w:bottom w:w="60" w:type="dxa"/>
-              <w:left w:w="100" w:type="dxa"/>
-              <w:right w:w="100" w:type="dxa"/>
+              <w:top w:w="80" w:type="dxa"/>
+              <w:bottom w:w="80" w:type="dxa"/>
+              <w:left w:w="120" w:type="dxa"/>
+              <w:right w:w="120" w:type="dxa"/>
             </w:tcMar>
           </w:tcPr>
           <w:p>
@@ -3727,7 +3789,7 @@
             <w:r>
               <w:rPr>
                 <w:rFonts w:ascii="Times New Roman" w:hAnsi="Times New Roman"/>
-                <w:sz w:val="18"/>
+                <w:sz w:val="20"/>
               </w:rPr>
               <w:t>Total Fwd Packets Bytes</w:t>
             </w:r>
@@ -3738,10 +3800,10 @@
             <w:tcW w:type="dxa" w:w="2592"/>
             <w:shd w:fill="FFFFFF"/>
             <w:tcMar>
-              <w:top w:w="60" w:type="dxa"/>
-              <w:bottom w:w="60" w:type="dxa"/>
-              <w:left w:w="100" w:type="dxa"/>
-              <w:right w:w="100" w:type="dxa"/>
+              <w:top w:w="80" w:type="dxa"/>
+              <w:bottom w:w="80" w:type="dxa"/>
+              <w:left w:w="120" w:type="dxa"/>
+              <w:right w:w="120" w:type="dxa"/>
             </w:tcMar>
           </w:tcPr>
           <w:p>
@@ -3751,7 +3813,7 @@
             <w:r>
               <w:rPr>
                 <w:rFonts w:ascii="Times New Roman" w:hAnsi="Times New Roman"/>
-                <w:sz w:val="18"/>
+                <w:sz w:val="20"/>
               </w:rPr>
               <w:t>Bytes sent from source to destination</w:t>
             </w:r>
@@ -3764,10 +3826,10 @@
             <w:tcW w:type="dxa" w:w="720"/>
             <w:shd w:fill="F8FAFC"/>
             <w:tcMar>
-              <w:top w:w="60" w:type="dxa"/>
-              <w:bottom w:w="60" w:type="dxa"/>
-              <w:left w:w="100" w:type="dxa"/>
-              <w:right w:w="100" w:type="dxa"/>
+              <w:top w:w="80" w:type="dxa"/>
+              <w:bottom w:w="80" w:type="dxa"/>
+              <w:left w:w="120" w:type="dxa"/>
+              <w:right w:w="120" w:type="dxa"/>
             </w:tcMar>
           </w:tcPr>
           <w:p>
@@ -3777,7 +3839,7 @@
             <w:r>
               <w:rPr>
                 <w:rFonts w:ascii="Times New Roman" w:hAnsi="Times New Roman"/>
-                <w:sz w:val="18"/>
+                <w:sz w:val="20"/>
               </w:rPr>
               <w:t>6</w:t>
             </w:r>
@@ -3788,10 +3850,10 @@
             <w:tcW w:type="dxa" w:w="2592"/>
             <w:shd w:fill="F8FAFC"/>
             <w:tcMar>
-              <w:top w:w="60" w:type="dxa"/>
-              <w:bottom w:w="60" w:type="dxa"/>
-              <w:left w:w="100" w:type="dxa"/>
-              <w:right w:w="100" w:type="dxa"/>
+              <w:top w:w="80" w:type="dxa"/>
+              <w:bottom w:w="80" w:type="dxa"/>
+              <w:left w:w="120" w:type="dxa"/>
+              <w:right w:w="120" w:type="dxa"/>
             </w:tcMar>
           </w:tcPr>
           <w:p>
@@ -3801,7 +3863,7 @@
             <w:r>
               <w:rPr>
                 <w:rFonts w:ascii="Times New Roman" w:hAnsi="Times New Roman"/>
-                <w:sz w:val="18"/>
+                <w:sz w:val="20"/>
               </w:rPr>
               <w:t>dst_bytes</w:t>
             </w:r>
@@ -3812,10 +3874,10 @@
             <w:tcW w:type="dxa" w:w="1872"/>
             <w:shd w:fill="F8FAFC"/>
             <w:tcMar>
-              <w:top w:w="60" w:type="dxa"/>
-              <w:bottom w:w="60" w:type="dxa"/>
-              <w:left w:w="100" w:type="dxa"/>
-              <w:right w:w="100" w:type="dxa"/>
+              <w:top w:w="80" w:type="dxa"/>
+              <w:bottom w:w="80" w:type="dxa"/>
+              <w:left w:w="120" w:type="dxa"/>
+              <w:right w:w="120" w:type="dxa"/>
             </w:tcMar>
           </w:tcPr>
           <w:p>
@@ -3825,7 +3887,7 @@
             <w:r>
               <w:rPr>
                 <w:rFonts w:ascii="Times New Roman" w:hAnsi="Times New Roman"/>
-                <w:sz w:val="18"/>
+                <w:sz w:val="20"/>
               </w:rPr>
               <w:t>Pruned</w:t>
             </w:r>
@@ -3836,10 +3898,10 @@
             <w:tcW w:type="dxa" w:w="2592"/>
             <w:shd w:fill="F8FAFC"/>
             <w:tcMar>
-              <w:top w:w="60" w:type="dxa"/>
-              <w:bottom w:w="60" w:type="dxa"/>
-              <w:left w:w="100" w:type="dxa"/>
-              <w:right w:w="100" w:type="dxa"/>
+              <w:top w:w="80" w:type="dxa"/>
+              <w:bottom w:w="80" w:type="dxa"/>
+              <w:left w:w="120" w:type="dxa"/>
+              <w:right w:w="120" w:type="dxa"/>
             </w:tcMar>
           </w:tcPr>
           <w:p>
@@ -3849,7 +3911,7 @@
             <w:r>
               <w:rPr>
                 <w:rFonts w:ascii="Times New Roman" w:hAnsi="Times New Roman"/>
-                <w:sz w:val="18"/>
+                <w:sz w:val="20"/>
               </w:rPr>
               <w:t>Total Bwd Packets Bytes</w:t>
             </w:r>
@@ -3860,10 +3922,10 @@
             <w:tcW w:type="dxa" w:w="2592"/>
             <w:shd w:fill="F8FAFC"/>
             <w:tcMar>
-              <w:top w:w="60" w:type="dxa"/>
-              <w:bottom w:w="60" w:type="dxa"/>
-              <w:left w:w="100" w:type="dxa"/>
-              <w:right w:w="100" w:type="dxa"/>
+              <w:top w:w="80" w:type="dxa"/>
+              <w:bottom w:w="80" w:type="dxa"/>
+              <w:left w:w="120" w:type="dxa"/>
+              <w:right w:w="120" w:type="dxa"/>
             </w:tcMar>
           </w:tcPr>
           <w:p>
@@ -3873,7 +3935,7 @@
             <w:r>
               <w:rPr>
                 <w:rFonts w:ascii="Times New Roman" w:hAnsi="Times New Roman"/>
-                <w:sz w:val="18"/>
+                <w:sz w:val="20"/>
               </w:rPr>
               <w:t>Bytes sent from destination to source</w:t>
             </w:r>
@@ -3886,10 +3948,10 @@
             <w:tcW w:type="dxa" w:w="720"/>
             <w:shd w:fill="FFFFFF"/>
             <w:tcMar>
-              <w:top w:w="60" w:type="dxa"/>
-              <w:bottom w:w="60" w:type="dxa"/>
-              <w:left w:w="100" w:type="dxa"/>
-              <w:right w:w="100" w:type="dxa"/>
+              <w:top w:w="80" w:type="dxa"/>
+              <w:bottom w:w="80" w:type="dxa"/>
+              <w:left w:w="120" w:type="dxa"/>
+              <w:right w:w="120" w:type="dxa"/>
             </w:tcMar>
           </w:tcPr>
           <w:p>
@@ -3899,7 +3961,7 @@
             <w:r>
               <w:rPr>
                 <w:rFonts w:ascii="Times New Roman" w:hAnsi="Times New Roman"/>
-                <w:sz w:val="18"/>
+                <w:sz w:val="20"/>
               </w:rPr>
               <w:t>7</w:t>
             </w:r>
@@ -3910,10 +3972,10 @@
             <w:tcW w:type="dxa" w:w="2592"/>
             <w:shd w:fill="FFFFFF"/>
             <w:tcMar>
-              <w:top w:w="60" w:type="dxa"/>
-              <w:bottom w:w="60" w:type="dxa"/>
-              <w:left w:w="100" w:type="dxa"/>
-              <w:right w:w="100" w:type="dxa"/>
+              <w:top w:w="80" w:type="dxa"/>
+              <w:bottom w:w="80" w:type="dxa"/>
+              <w:left w:w="120" w:type="dxa"/>
+              <w:right w:w="120" w:type="dxa"/>
             </w:tcMar>
           </w:tcPr>
           <w:p>
@@ -3923,7 +3985,7 @@
             <w:r>
               <w:rPr>
                 <w:rFonts w:ascii="Times New Roman" w:hAnsi="Times New Roman"/>
-                <w:sz w:val="18"/>
+                <w:sz w:val="20"/>
               </w:rPr>
               <w:t>hot</w:t>
             </w:r>
@@ -3934,10 +3996,10 @@
             <w:tcW w:type="dxa" w:w="1872"/>
             <w:shd w:fill="FFFFFF"/>
             <w:tcMar>
-              <w:top w:w="60" w:type="dxa"/>
-              <w:bottom w:w="60" w:type="dxa"/>
-              <w:left w:w="100" w:type="dxa"/>
-              <w:right w:w="100" w:type="dxa"/>
+              <w:top w:w="80" w:type="dxa"/>
+              <w:bottom w:w="80" w:type="dxa"/>
+              <w:left w:w="120" w:type="dxa"/>
+              <w:right w:w="120" w:type="dxa"/>
             </w:tcMar>
           </w:tcPr>
           <w:p>
@@ -3947,7 +4009,7 @@
             <w:r>
               <w:rPr>
                 <w:rFonts w:ascii="Times New Roman" w:hAnsi="Times New Roman"/>
-                <w:sz w:val="18"/>
+                <w:sz w:val="20"/>
               </w:rPr>
               <w:t>SELECTED (9)</w:t>
             </w:r>
@@ -3958,10 +4020,10 @@
             <w:tcW w:type="dxa" w:w="2592"/>
             <w:shd w:fill="FFFFFF"/>
             <w:tcMar>
-              <w:top w:w="60" w:type="dxa"/>
-              <w:bottom w:w="60" w:type="dxa"/>
-              <w:left w:w="100" w:type="dxa"/>
-              <w:right w:w="100" w:type="dxa"/>
+              <w:top w:w="80" w:type="dxa"/>
+              <w:bottom w:w="80" w:type="dxa"/>
+              <w:left w:w="120" w:type="dxa"/>
+              <w:right w:w="120" w:type="dxa"/>
             </w:tcMar>
           </w:tcPr>
           <w:p>
@@ -3971,7 +4033,7 @@
             <w:r>
               <w:rPr>
                 <w:rFonts w:ascii="Times New Roman" w:hAnsi="Times New Roman"/>
-                <w:sz w:val="18"/>
+                <w:sz w:val="20"/>
               </w:rPr>
               <w:t>Sensitive File Access</w:t>
             </w:r>
@@ -3982,10 +4044,10 @@
             <w:tcW w:type="dxa" w:w="2592"/>
             <w:shd w:fill="FFFFFF"/>
             <w:tcMar>
-              <w:top w:w="60" w:type="dxa"/>
-              <w:bottom w:w="60" w:type="dxa"/>
-              <w:left w:w="100" w:type="dxa"/>
-              <w:right w:w="100" w:type="dxa"/>
+              <w:top w:w="80" w:type="dxa"/>
+              <w:bottom w:w="80" w:type="dxa"/>
+              <w:left w:w="120" w:type="dxa"/>
+              <w:right w:w="120" w:type="dxa"/>
             </w:tcMar>
           </w:tcPr>
           <w:p>
@@ -3995,7 +4057,7 @@
             <w:r>
               <w:rPr>
                 <w:rFonts w:ascii="Times New Roman" w:hAnsi="Times New Roman"/>
-                <w:sz w:val="18"/>
+                <w:sz w:val="20"/>
               </w:rPr>
               <w:t>Indicators of sensitive system access</w:t>
             </w:r>
@@ -4008,10 +4070,10 @@
             <w:tcW w:type="dxa" w:w="720"/>
             <w:shd w:fill="F8FAFC"/>
             <w:tcMar>
-              <w:top w:w="60" w:type="dxa"/>
-              <w:bottom w:w="60" w:type="dxa"/>
-              <w:left w:w="100" w:type="dxa"/>
-              <w:right w:w="100" w:type="dxa"/>
+              <w:top w:w="80" w:type="dxa"/>
+              <w:bottom w:w="80" w:type="dxa"/>
+              <w:left w:w="120" w:type="dxa"/>
+              <w:right w:w="120" w:type="dxa"/>
             </w:tcMar>
           </w:tcPr>
           <w:p>
@@ -4021,7 +4083,7 @@
             <w:r>
               <w:rPr>
                 <w:rFonts w:ascii="Times New Roman" w:hAnsi="Times New Roman"/>
-                <w:sz w:val="18"/>
+                <w:sz w:val="20"/>
               </w:rPr>
               <w:t>8</w:t>
             </w:r>
@@ -4032,10 +4094,10 @@
             <w:tcW w:type="dxa" w:w="2592"/>
             <w:shd w:fill="F8FAFC"/>
             <w:tcMar>
-              <w:top w:w="60" w:type="dxa"/>
-              <w:bottom w:w="60" w:type="dxa"/>
-              <w:left w:w="100" w:type="dxa"/>
-              <w:right w:w="100" w:type="dxa"/>
+              <w:top w:w="80" w:type="dxa"/>
+              <w:bottom w:w="80" w:type="dxa"/>
+              <w:left w:w="120" w:type="dxa"/>
+              <w:right w:w="120" w:type="dxa"/>
             </w:tcMar>
           </w:tcPr>
           <w:p>
@@ -4045,7 +4107,7 @@
             <w:r>
               <w:rPr>
                 <w:rFonts w:ascii="Times New Roman" w:hAnsi="Times New Roman"/>
-                <w:sz w:val="18"/>
+                <w:sz w:val="20"/>
               </w:rPr>
               <w:t>su_attempted</w:t>
             </w:r>
@@ -4056,10 +4118,10 @@
             <w:tcW w:type="dxa" w:w="1872"/>
             <w:shd w:fill="F8FAFC"/>
             <w:tcMar>
-              <w:top w:w="60" w:type="dxa"/>
-              <w:bottom w:w="60" w:type="dxa"/>
-              <w:left w:w="100" w:type="dxa"/>
-              <w:right w:w="100" w:type="dxa"/>
+              <w:top w:w="80" w:type="dxa"/>
+              <w:bottom w:w="80" w:type="dxa"/>
+              <w:left w:w="120" w:type="dxa"/>
+              <w:right w:w="120" w:type="dxa"/>
             </w:tcMar>
           </w:tcPr>
           <w:p>
@@ -4069,7 +4131,7 @@
             <w:r>
               <w:rPr>
                 <w:rFonts w:ascii="Times New Roman" w:hAnsi="Times New Roman"/>
-                <w:sz w:val="18"/>
+                <w:sz w:val="20"/>
               </w:rPr>
               <w:t>SELECTED (10)</w:t>
             </w:r>
@@ -4080,10 +4142,10 @@
             <w:tcW w:type="dxa" w:w="2592"/>
             <w:shd w:fill="F8FAFC"/>
             <w:tcMar>
-              <w:top w:w="60" w:type="dxa"/>
-              <w:bottom w:w="60" w:type="dxa"/>
-              <w:left w:w="100" w:type="dxa"/>
-              <w:right w:w="100" w:type="dxa"/>
+              <w:top w:w="80" w:type="dxa"/>
+              <w:bottom w:w="80" w:type="dxa"/>
+              <w:left w:w="120" w:type="dxa"/>
+              <w:right w:w="120" w:type="dxa"/>
             </w:tcMar>
           </w:tcPr>
           <w:p>
@@ -4093,7 +4155,7 @@
             <w:r>
               <w:rPr>
                 <w:rFonts w:ascii="Times New Roman" w:hAnsi="Times New Roman"/>
-                <w:sz w:val="18"/>
+                <w:sz w:val="20"/>
               </w:rPr>
               <w:t>Privilege Escalation Flag</w:t>
             </w:r>
@@ -4104,10 +4166,10 @@
             <w:tcW w:type="dxa" w:w="2592"/>
             <w:shd w:fill="F8FAFC"/>
             <w:tcMar>
-              <w:top w:w="60" w:type="dxa"/>
-              <w:bottom w:w="60" w:type="dxa"/>
-              <w:left w:w="100" w:type="dxa"/>
-              <w:right w:w="100" w:type="dxa"/>
+              <w:top w:w="80" w:type="dxa"/>
+              <w:bottom w:w="80" w:type="dxa"/>
+              <w:left w:w="120" w:type="dxa"/>
+              <w:right w:w="120" w:type="dxa"/>
             </w:tcMar>
           </w:tcPr>
           <w:p>
@@ -4117,7 +4179,7 @@
             <w:r>
               <w:rPr>
                 <w:rFonts w:ascii="Times New Roman" w:hAnsi="Times New Roman"/>
-                <w:sz w:val="18"/>
+                <w:sz w:val="20"/>
               </w:rPr>
               <w:t>Root/admin privilege escalation attempts</w:t>
             </w:r>
@@ -4130,10 +4192,10 @@
             <w:tcW w:type="dxa" w:w="720"/>
             <w:shd w:fill="FFFFFF"/>
             <w:tcMar>
-              <w:top w:w="60" w:type="dxa"/>
-              <w:bottom w:w="60" w:type="dxa"/>
-              <w:left w:w="100" w:type="dxa"/>
-              <w:right w:w="100" w:type="dxa"/>
+              <w:top w:w="80" w:type="dxa"/>
+              <w:bottom w:w="80" w:type="dxa"/>
+              <w:left w:w="120" w:type="dxa"/>
+              <w:right w:w="120" w:type="dxa"/>
             </w:tcMar>
           </w:tcPr>
           <w:p>
@@ -4143,7 +4205,7 @@
             <w:r>
               <w:rPr>
                 <w:rFonts w:ascii="Times New Roman" w:hAnsi="Times New Roman"/>
-                <w:sz w:val="18"/>
+                <w:sz w:val="20"/>
               </w:rPr>
               <w:t>9</w:t>
             </w:r>
@@ -4154,10 +4216,10 @@
             <w:tcW w:type="dxa" w:w="2592"/>
             <w:shd w:fill="FFFFFF"/>
             <w:tcMar>
-              <w:top w:w="60" w:type="dxa"/>
-              <w:bottom w:w="60" w:type="dxa"/>
-              <w:left w:w="100" w:type="dxa"/>
-              <w:right w:w="100" w:type="dxa"/>
+              <w:top w:w="80" w:type="dxa"/>
+              <w:bottom w:w="80" w:type="dxa"/>
+              <w:left w:w="120" w:type="dxa"/>
+              <w:right w:w="120" w:type="dxa"/>
             </w:tcMar>
           </w:tcPr>
           <w:p>
@@ -4167,7 +4229,7 @@
             <w:r>
               <w:rPr>
                 <w:rFonts w:ascii="Times New Roman" w:hAnsi="Times New Roman"/>
-                <w:sz w:val="18"/>
+                <w:sz w:val="20"/>
               </w:rPr>
               <w:t>serror_rate</w:t>
             </w:r>
@@ -4178,10 +4240,10 @@
             <w:tcW w:type="dxa" w:w="1872"/>
             <w:shd w:fill="FFFFFF"/>
             <w:tcMar>
-              <w:top w:w="60" w:type="dxa"/>
-              <w:bottom w:w="60" w:type="dxa"/>
-              <w:left w:w="100" w:type="dxa"/>
-              <w:right w:w="100" w:type="dxa"/>
+              <w:top w:w="80" w:type="dxa"/>
+              <w:bottom w:w="80" w:type="dxa"/>
+              <w:left w:w="120" w:type="dxa"/>
+              <w:right w:w="120" w:type="dxa"/>
             </w:tcMar>
           </w:tcPr>
           <w:p>
@@ -4191,7 +4253,7 @@
             <w:r>
               <w:rPr>
                 <w:rFonts w:ascii="Times New Roman" w:hAnsi="Times New Roman"/>
-                <w:sz w:val="18"/>
+                <w:sz w:val="20"/>
               </w:rPr>
               <w:t>SELECTED (4)</w:t>
             </w:r>
@@ -4202,10 +4264,10 @@
             <w:tcW w:type="dxa" w:w="2592"/>
             <w:shd w:fill="FFFFFF"/>
             <w:tcMar>
-              <w:top w:w="60" w:type="dxa"/>
-              <w:bottom w:w="60" w:type="dxa"/>
-              <w:left w:w="100" w:type="dxa"/>
-              <w:right w:w="100" w:type="dxa"/>
+              <w:top w:w="80" w:type="dxa"/>
+              <w:bottom w:w="80" w:type="dxa"/>
+              <w:left w:w="120" w:type="dxa"/>
+              <w:right w:w="120" w:type="dxa"/>
             </w:tcMar>
           </w:tcPr>
           <w:p>
@@ -4215,7 +4277,7 @@
             <w:r>
               <w:rPr>
                 <w:rFonts w:ascii="Times New Roman" w:hAnsi="Times New Roman"/>
-                <w:sz w:val="18"/>
+                <w:sz w:val="20"/>
               </w:rPr>
               <w:t>SYN Error Rate</w:t>
             </w:r>
@@ -4226,10 +4288,10 @@
             <w:tcW w:type="dxa" w:w="2592"/>
             <w:shd w:fill="FFFFFF"/>
             <w:tcMar>
-              <w:top w:w="60" w:type="dxa"/>
-              <w:bottom w:w="60" w:type="dxa"/>
-              <w:left w:w="100" w:type="dxa"/>
-              <w:right w:w="100" w:type="dxa"/>
+              <w:top w:w="80" w:type="dxa"/>
+              <w:bottom w:w="80" w:type="dxa"/>
+              <w:left w:w="120" w:type="dxa"/>
+              <w:right w:w="120" w:type="dxa"/>
             </w:tcMar>
           </w:tcPr>
           <w:p>
@@ -4239,7 +4301,7 @@
             <w:r>
               <w:rPr>
                 <w:rFonts w:ascii="Times New Roman" w:hAnsi="Times New Roman"/>
-                <w:sz w:val="18"/>
+                <w:sz w:val="20"/>
               </w:rPr>
               <w:t>Proportion of connections with SYN errors</w:t>
             </w:r>
@@ -4252,10 +4314,10 @@
             <w:tcW w:type="dxa" w:w="720"/>
             <w:shd w:fill="F8FAFC"/>
             <w:tcMar>
-              <w:top w:w="60" w:type="dxa"/>
-              <w:bottom w:w="60" w:type="dxa"/>
-              <w:left w:w="100" w:type="dxa"/>
-              <w:right w:w="100" w:type="dxa"/>
+              <w:top w:w="80" w:type="dxa"/>
+              <w:bottom w:w="80" w:type="dxa"/>
+              <w:left w:w="120" w:type="dxa"/>
+              <w:right w:w="120" w:type="dxa"/>
             </w:tcMar>
           </w:tcPr>
           <w:p>
@@ -4265,7 +4327,7 @@
             <w:r>
               <w:rPr>
                 <w:rFonts w:ascii="Times New Roman" w:hAnsi="Times New Roman"/>
-                <w:sz w:val="18"/>
+                <w:sz w:val="20"/>
               </w:rPr>
               <w:t>10</w:t>
             </w:r>
@@ -4276,10 +4338,10 @@
             <w:tcW w:type="dxa" w:w="2592"/>
             <w:shd w:fill="F8FAFC"/>
             <w:tcMar>
-              <w:top w:w="60" w:type="dxa"/>
-              <w:bottom w:w="60" w:type="dxa"/>
-              <w:left w:w="100" w:type="dxa"/>
-              <w:right w:w="100" w:type="dxa"/>
+              <w:top w:w="80" w:type="dxa"/>
+              <w:bottom w:w="80" w:type="dxa"/>
+              <w:left w:w="120" w:type="dxa"/>
+              <w:right w:w="120" w:type="dxa"/>
             </w:tcMar>
           </w:tcPr>
           <w:p>
@@ -4289,7 +4351,7 @@
             <w:r>
               <w:rPr>
                 <w:rFonts w:ascii="Times New Roman" w:hAnsi="Times New Roman"/>
-                <w:sz w:val="18"/>
+                <w:sz w:val="20"/>
               </w:rPr>
               <w:t>same_srv_rate</w:t>
             </w:r>
@@ -4300,10 +4362,10 @@
             <w:tcW w:type="dxa" w:w="1872"/>
             <w:shd w:fill="F8FAFC"/>
             <w:tcMar>
-              <w:top w:w="60" w:type="dxa"/>
-              <w:bottom w:w="60" w:type="dxa"/>
-              <w:left w:w="100" w:type="dxa"/>
-              <w:right w:w="100" w:type="dxa"/>
+              <w:top w:w="80" w:type="dxa"/>
+              <w:bottom w:w="80" w:type="dxa"/>
+              <w:left w:w="120" w:type="dxa"/>
+              <w:right w:w="120" w:type="dxa"/>
             </w:tcMar>
           </w:tcPr>
           <w:p>
@@ -4313,7 +4375,7 @@
             <w:r>
               <w:rPr>
                 <w:rFonts w:ascii="Times New Roman" w:hAnsi="Times New Roman"/>
-                <w:sz w:val="18"/>
+                <w:sz w:val="20"/>
               </w:rPr>
               <w:t>SELECTED (5)</w:t>
             </w:r>
@@ -4324,10 +4386,10 @@
             <w:tcW w:type="dxa" w:w="2592"/>
             <w:shd w:fill="F8FAFC"/>
             <w:tcMar>
-              <w:top w:w="60" w:type="dxa"/>
-              <w:bottom w:w="60" w:type="dxa"/>
-              <w:left w:w="100" w:type="dxa"/>
-              <w:right w:w="100" w:type="dxa"/>
+              <w:top w:w="80" w:type="dxa"/>
+              <w:bottom w:w="80" w:type="dxa"/>
+              <w:left w:w="120" w:type="dxa"/>
+              <w:right w:w="120" w:type="dxa"/>
             </w:tcMar>
           </w:tcPr>
           <w:p>
@@ -4337,7 +4399,7 @@
             <w:r>
               <w:rPr>
                 <w:rFonts w:ascii="Times New Roman" w:hAnsi="Times New Roman"/>
-                <w:sz w:val="18"/>
+                <w:sz w:val="20"/>
               </w:rPr>
               <w:t>Same Service Ratio</w:t>
             </w:r>
@@ -4348,10 +4410,10 @@
             <w:tcW w:type="dxa" w:w="2592"/>
             <w:shd w:fill="F8FAFC"/>
             <w:tcMar>
-              <w:top w:w="60" w:type="dxa"/>
-              <w:bottom w:w="60" w:type="dxa"/>
-              <w:left w:w="100" w:type="dxa"/>
-              <w:right w:w="100" w:type="dxa"/>
+              <w:top w:w="80" w:type="dxa"/>
+              <w:bottom w:w="80" w:type="dxa"/>
+              <w:left w:w="120" w:type="dxa"/>
+              <w:right w:w="120" w:type="dxa"/>
             </w:tcMar>
           </w:tcPr>
           <w:p>
@@ -4361,7 +4423,7 @@
             <w:r>
               <w:rPr>
                 <w:rFonts w:ascii="Times New Roman" w:hAnsi="Times New Roman"/>
-                <w:sz w:val="18"/>
+                <w:sz w:val="20"/>
               </w:rPr>
               <w:t>Proportion of connections to same service</w:t>
             </w:r>
@@ -4374,10 +4436,10 @@
             <w:tcW w:type="dxa" w:w="720"/>
             <w:shd w:fill="FFFFFF"/>
             <w:tcMar>
-              <w:top w:w="60" w:type="dxa"/>
-              <w:bottom w:w="60" w:type="dxa"/>
-              <w:left w:w="100" w:type="dxa"/>
-              <w:right w:w="100" w:type="dxa"/>
+              <w:top w:w="80" w:type="dxa"/>
+              <w:bottom w:w="80" w:type="dxa"/>
+              <w:left w:w="120" w:type="dxa"/>
+              <w:right w:w="120" w:type="dxa"/>
             </w:tcMar>
           </w:tcPr>
           <w:p>
@@ -4387,7 +4449,7 @@
             <w:r>
               <w:rPr>
                 <w:rFonts w:ascii="Times New Roman" w:hAnsi="Times New Roman"/>
-                <w:sz w:val="18"/>
+                <w:sz w:val="20"/>
               </w:rPr>
               <w:t>11</w:t>
             </w:r>
@@ -4398,10 +4460,10 @@
             <w:tcW w:type="dxa" w:w="2592"/>
             <w:shd w:fill="FFFFFF"/>
             <w:tcMar>
-              <w:top w:w="60" w:type="dxa"/>
-              <w:bottom w:w="60" w:type="dxa"/>
-              <w:left w:w="100" w:type="dxa"/>
-              <w:right w:w="100" w:type="dxa"/>
+              <w:top w:w="80" w:type="dxa"/>
+              <w:bottom w:w="80" w:type="dxa"/>
+              <w:left w:w="120" w:type="dxa"/>
+              <w:right w:w="120" w:type="dxa"/>
             </w:tcMar>
           </w:tcPr>
           <w:p>
@@ -4411,7 +4473,7 @@
             <w:r>
               <w:rPr>
                 <w:rFonts w:ascii="Times New Roman" w:hAnsi="Times New Roman"/>
-                <w:sz w:val="18"/>
+                <w:sz w:val="20"/>
               </w:rPr>
               <w:t>diff_srv_rate</w:t>
             </w:r>
@@ -4422,10 +4484,10 @@
             <w:tcW w:type="dxa" w:w="1872"/>
             <w:shd w:fill="FFFFFF"/>
             <w:tcMar>
-              <w:top w:w="60" w:type="dxa"/>
-              <w:bottom w:w="60" w:type="dxa"/>
-              <w:left w:w="100" w:type="dxa"/>
-              <w:right w:w="100" w:type="dxa"/>
+              <w:top w:w="80" w:type="dxa"/>
+              <w:bottom w:w="80" w:type="dxa"/>
+              <w:left w:w="120" w:type="dxa"/>
+              <w:right w:w="120" w:type="dxa"/>
             </w:tcMar>
           </w:tcPr>
           <w:p>
@@ -4435,7 +4497,7 @@
             <w:r>
               <w:rPr>
                 <w:rFonts w:ascii="Times New Roman" w:hAnsi="Times New Roman"/>
-                <w:sz w:val="18"/>
+                <w:sz w:val="20"/>
               </w:rPr>
               <w:t>SELECTED (6)</w:t>
             </w:r>
@@ -4446,10 +4508,10 @@
             <w:tcW w:type="dxa" w:w="2592"/>
             <w:shd w:fill="FFFFFF"/>
             <w:tcMar>
-              <w:top w:w="60" w:type="dxa"/>
-              <w:bottom w:w="60" w:type="dxa"/>
-              <w:left w:w="100" w:type="dxa"/>
-              <w:right w:w="100" w:type="dxa"/>
+              <w:top w:w="80" w:type="dxa"/>
+              <w:bottom w:w="80" w:type="dxa"/>
+              <w:left w:w="120" w:type="dxa"/>
+              <w:right w:w="120" w:type="dxa"/>
             </w:tcMar>
           </w:tcPr>
           <w:p>
@@ -4459,7 +4521,7 @@
             <w:r>
               <w:rPr>
                 <w:rFonts w:ascii="Times New Roman" w:hAnsi="Times New Roman"/>
-                <w:sz w:val="18"/>
+                <w:sz w:val="20"/>
               </w:rPr>
               <w:t>Diff Service Ratio</w:t>
             </w:r>
@@ -4470,10 +4532,10 @@
             <w:tcW w:type="dxa" w:w="2592"/>
             <w:shd w:fill="FFFFFF"/>
             <w:tcMar>
-              <w:top w:w="60" w:type="dxa"/>
-              <w:bottom w:w="60" w:type="dxa"/>
-              <w:left w:w="100" w:type="dxa"/>
-              <w:right w:w="100" w:type="dxa"/>
+              <w:top w:w="80" w:type="dxa"/>
+              <w:bottom w:w="80" w:type="dxa"/>
+              <w:left w:w="120" w:type="dxa"/>
+              <w:right w:w="120" w:type="dxa"/>
             </w:tcMar>
           </w:tcPr>
           <w:p>
@@ -4483,7 +4545,7 @@
             <w:r>
               <w:rPr>
                 <w:rFonts w:ascii="Times New Roman" w:hAnsi="Times New Roman"/>
-                <w:sz w:val="18"/>
+                <w:sz w:val="20"/>
               </w:rPr>
               <w:t>Proportion of connections to different services</w:t>
             </w:r>
@@ -4496,10 +4558,10 @@
             <w:tcW w:type="dxa" w:w="720"/>
             <w:shd w:fill="F8FAFC"/>
             <w:tcMar>
-              <w:top w:w="60" w:type="dxa"/>
-              <w:bottom w:w="60" w:type="dxa"/>
-              <w:left w:w="100" w:type="dxa"/>
-              <w:right w:w="100" w:type="dxa"/>
+              <w:top w:w="80" w:type="dxa"/>
+              <w:bottom w:w="80" w:type="dxa"/>
+              <w:left w:w="120" w:type="dxa"/>
+              <w:right w:w="120" w:type="dxa"/>
             </w:tcMar>
           </w:tcPr>
           <w:p>
@@ -4509,7 +4571,7 @@
             <w:r>
               <w:rPr>
                 <w:rFonts w:ascii="Times New Roman" w:hAnsi="Times New Roman"/>
-                <w:sz w:val="18"/>
+                <w:sz w:val="20"/>
               </w:rPr>
               <w:t>12</w:t>
             </w:r>
@@ -4520,10 +4582,10 @@
             <w:tcW w:type="dxa" w:w="2592"/>
             <w:shd w:fill="F8FAFC"/>
             <w:tcMar>
-              <w:top w:w="60" w:type="dxa"/>
-              <w:bottom w:w="60" w:type="dxa"/>
-              <w:left w:w="100" w:type="dxa"/>
-              <w:right w:w="100" w:type="dxa"/>
+              <w:top w:w="80" w:type="dxa"/>
+              <w:bottom w:w="80" w:type="dxa"/>
+              <w:left w:w="120" w:type="dxa"/>
+              <w:right w:w="120" w:type="dxa"/>
             </w:tcMar>
           </w:tcPr>
           <w:p>
@@ -4533,7 +4595,7 @@
             <w:r>
               <w:rPr>
                 <w:rFonts w:ascii="Times New Roman" w:hAnsi="Times New Roman"/>
-                <w:sz w:val="18"/>
+                <w:sz w:val="20"/>
               </w:rPr>
               <w:t>dst_host_diff_srv_rate</w:t>
             </w:r>
@@ -4544,10 +4606,10 @@
             <w:tcW w:type="dxa" w:w="1872"/>
             <w:shd w:fill="F8FAFC"/>
             <w:tcMar>
-              <w:top w:w="60" w:type="dxa"/>
-              <w:bottom w:w="60" w:type="dxa"/>
-              <w:left w:w="100" w:type="dxa"/>
-              <w:right w:w="100" w:type="dxa"/>
+              <w:top w:w="80" w:type="dxa"/>
+              <w:bottom w:w="80" w:type="dxa"/>
+              <w:left w:w="120" w:type="dxa"/>
+              <w:right w:w="120" w:type="dxa"/>
             </w:tcMar>
           </w:tcPr>
           <w:p>
@@ -4557,7 +4619,7 @@
             <w:r>
               <w:rPr>
                 <w:rFonts w:ascii="Times New Roman" w:hAnsi="Times New Roman"/>
-                <w:sz w:val="18"/>
+                <w:sz w:val="20"/>
               </w:rPr>
               <w:t>SELECTED (7)</w:t>
             </w:r>
@@ -4568,10 +4630,10 @@
             <w:tcW w:type="dxa" w:w="2592"/>
             <w:shd w:fill="F8FAFC"/>
             <w:tcMar>
-              <w:top w:w="60" w:type="dxa"/>
-              <w:bottom w:w="60" w:type="dxa"/>
-              <w:left w:w="100" w:type="dxa"/>
-              <w:right w:w="100" w:type="dxa"/>
+              <w:top w:w="80" w:type="dxa"/>
+              <w:bottom w:w="80" w:type="dxa"/>
+              <w:left w:w="120" w:type="dxa"/>
+              <w:right w:w="120" w:type="dxa"/>
             </w:tcMar>
           </w:tcPr>
           <w:p>
@@ -4581,7 +4643,7 @@
             <w:r>
               <w:rPr>
                 <w:rFonts w:ascii="Times New Roman" w:hAnsi="Times New Roman"/>
-                <w:sz w:val="18"/>
+                <w:sz w:val="20"/>
               </w:rPr>
               <w:t>Dst Host Diff Srv Rate</w:t>
             </w:r>
@@ -4592,10 +4654,10 @@
             <w:tcW w:type="dxa" w:w="2592"/>
             <w:shd w:fill="F8FAFC"/>
             <w:tcMar>
-              <w:top w:w="60" w:type="dxa"/>
-              <w:bottom w:w="60" w:type="dxa"/>
-              <w:left w:w="100" w:type="dxa"/>
-              <w:right w:w="100" w:type="dxa"/>
+              <w:top w:w="80" w:type="dxa"/>
+              <w:bottom w:w="80" w:type="dxa"/>
+              <w:left w:w="120" w:type="dxa"/>
+              <w:right w:w="120" w:type="dxa"/>
             </w:tcMar>
           </w:tcPr>
           <w:p>
@@ -4605,7 +4667,7 @@
             <w:r>
               <w:rPr>
                 <w:rFonts w:ascii="Times New Roman" w:hAnsi="Times New Roman"/>
-                <w:sz w:val="18"/>
+                <w:sz w:val="20"/>
               </w:rPr>
               <w:t>Destination host service dispersion</w:t>
             </w:r>
@@ -4627,23 +4689,23 @@
         <w:rPr>
           <w:rFonts w:ascii="Arial" w:hAnsi="Arial"/>
           <w:b/>
-          <w:color w:val="0F172A"/>
-          <w:sz w:val="23"/>
+          <w:color w:val="1E293B"/>
+          <w:sz w:val="25"/>
         </w:rPr>
         <w:t>APPENDIX D: User Acceptance Testing (UAT) Questionnaire</w:t>
       </w:r>
     </w:p>
     <w:p>
       <w:pPr>
-        <w:spacing w:line="312" w:lineRule="auto" w:after="120"/>
+        <w:spacing w:line="360" w:lineRule="auto" w:after="120"/>
         <w:jc w:val="both"/>
       </w:pPr>
       <w:r>
         <w:rPr>
           <w:rFonts w:ascii="Times New Roman" w:hAnsi="Times New Roman"/>
-          <w:sz w:val="21"/>
+          <w:sz w:val="24"/>
         </w:rPr>
-        <w:t>Domain specialists (3 cybersecurity analysts and 2 mining OT engineers) scored the platform on a 1–5 Likert scale across five criteria:</w:t>
+        <w:t>Domain specialists (3 cybersecurity analysts and 2 mining OT engineers) scored the platform on a 1 to 5 Likert scale across five criteria:</w:t>
         <w:br/>
         <w:t>1. Alert Clarity: Are threat predictions understandable without deep cybersecurity expertise?</w:t>
         <w:br/>
@@ -4665,8 +4727,8 @@
         <w:rPr>
           <w:rFonts w:ascii="Arial" w:hAnsi="Arial"/>
           <w:b/>
-          <w:color w:val="0F172A"/>
-          <w:sz w:val="23"/>
+          <w:color w:val="1E293B"/>
+          <w:sz w:val="25"/>
         </w:rPr>
         <w:t>APPENDIX E: Repository &amp; Reproducibility Links</w:t>
       </w:r>
@@ -4674,20 +4736,20 @@
     <w:p>
       <w:pPr>
         <w:pStyle w:val="ListBullet"/>
-        <w:spacing w:line="288" w:lineRule="auto" w:after="60"/>
+        <w:spacing w:line="312" w:lineRule="auto" w:after="80"/>
       </w:pPr>
       <w:r>
         <w:rPr>
           <w:rFonts w:ascii="Times New Roman" w:hAnsi="Times New Roman"/>
           <w:b/>
-          <w:sz w:val="20"/>
+          <w:sz w:val="24"/>
         </w:rPr>
         <w:t xml:space="preserve">Source Code: </w:t>
       </w:r>
       <w:r>
         <w:rPr>
           <w:rFonts w:ascii="Times New Roman" w:hAnsi="Times New Roman"/>
-          <w:sz w:val="20"/>
+          <w:sz w:val="24"/>
         </w:rPr>
         <w:t>GitHub Main Repository: https://github.com/mhiskall282/Securing-the-Digital-Mine-UNESCO-Project</w:t>
       </w:r>
@@ -4695,20 +4757,20 @@
     <w:p>
       <w:pPr>
         <w:pStyle w:val="ListBullet"/>
-        <w:spacing w:line="288" w:lineRule="auto" w:after="60"/>
+        <w:spacing w:line="312" w:lineRule="auto" w:after="80"/>
       </w:pPr>
       <w:r>
         <w:rPr>
           <w:rFonts w:ascii="Times New Roman" w:hAnsi="Times New Roman"/>
           <w:b/>
-          <w:sz w:val="20"/>
+          <w:sz w:val="24"/>
         </w:rPr>
         <w:t xml:space="preserve">CLI Package: </w:t>
       </w:r>
       <w:r>
         <w:rPr>
           <w:rFonts w:ascii="Times New Roman" w:hAnsi="Times New Roman"/>
-          <w:sz w:val="20"/>
+          <w:sz w:val="24"/>
         </w:rPr>
         <w:t>NPM Package (GitHub Packages): @mhiskall282/unesco-mine-sec-cli</w:t>
       </w:r>
@@ -4716,20 +4778,20 @@
     <w:p>
       <w:pPr>
         <w:pStyle w:val="ListBullet"/>
-        <w:spacing w:line="288" w:lineRule="auto" w:after="60"/>
+        <w:spacing w:line="312" w:lineRule="auto" w:after="80"/>
       </w:pPr>
       <w:r>
         <w:rPr>
           <w:rFonts w:ascii="Times New Roman" w:hAnsi="Times New Roman"/>
           <w:b/>
-          <w:sz w:val="20"/>
+          <w:sz w:val="24"/>
         </w:rPr>
         <w:t xml:space="preserve">Google Colab: </w:t>
       </w:r>
       <w:r>
         <w:rPr>
           <w:rFonts w:ascii="Times New Roman" w:hAnsi="Times New Roman"/>
-          <w:sz w:val="20"/>
+          <w:sz w:val="24"/>
         </w:rPr>
         <w:t>Google Colab Training Pipeline: notebooks/00_colab_setup_and_train.ipynb</w:t>
       </w:r>
@@ -4737,20 +4799,20 @@
     <w:p>
       <w:pPr>
         <w:pStyle w:val="ListBullet"/>
-        <w:spacing w:line="288" w:lineRule="auto" w:after="60"/>
+        <w:spacing w:line="312" w:lineRule="auto" w:after="80"/>
       </w:pPr>
       <w:r>
         <w:rPr>
           <w:rFonts w:ascii="Times New Roman" w:hAnsi="Times New Roman"/>
           <w:b/>
-          <w:sz w:val="20"/>
+          <w:sz w:val="24"/>
         </w:rPr>
         <w:t xml:space="preserve">Live Demo: </w:t>
       </w:r>
       <w:r>
         <w:rPr>
           <w:rFonts w:ascii="Times New Roman" w:hAnsi="Times New Roman"/>
-          <w:sz w:val="20"/>
+          <w:sz w:val="24"/>
         </w:rPr>
         <w:t>Live Dashboard URL: https://minesec-dashboard-prod.onrender.com</w:t>
       </w:r>

</xml_diff>